<commit_message>
Update root cause analysis report and validation document
</commit_message>
<xml_diff>
--- a/backend/src/report/LLM_Root_Cause_Extraction_Assigned_Investigated_Cases_Analysis_2.docx
+++ b/backend/src/report/LLM_Root_Cause_Extraction_Assigned_Investigated_Cases_Analysis_2.docx
@@ -244,6 +244,30 @@
     </w:p>
     <w:p>
       <w:r>
+        <w:t xml:space="preserve">QIAN, </w:t>
+      </w:r>
+      <w:proofErr w:type="spellStart"/>
+      <w:r>
+        <w:t>Yinjue</w:t>
+      </w:r>
+      <w:proofErr w:type="spellEnd"/>
+      <w:r>
+        <w:t>:</w:t>
+      </w:r>
+    </w:p>
+    <w:p>
+      <w:r>
+        <w:rPr>
+          <w:highlight w:val="yellow"/>
+        </w:rPr>
+        <w:t>Hi Yibo, the generated root cause is quite common, it may provide some directions for the defect fixing, however, it seems not so useful.</w:t>
+      </w:r>
+      <w:r>
+        <w:t> </w:t>
+      </w:r>
+    </w:p>
+    <w:p>
+      <w:r>
         <w:pict w14:anchorId="6606A73C">
           <v:rect id="_x0000_i1025" style="width:0;height:1.5pt" o:hralign="center" o:hrstd="t" o:hr="t" fillcolor="#a0a0a0" stroked="f"/>
         </w:pict>
@@ -261,6 +285,7 @@
           <w:b/>
           <w:bCs/>
         </w:rPr>
+        <w:lastRenderedPageBreak/>
         <w:t>2) Defect ID: 1552319</w:t>
       </w:r>
     </w:p>
@@ -283,7 +308,6 @@
           <w:b/>
           <w:bCs/>
         </w:rPr>
-        <w:lastRenderedPageBreak/>
         <w:t>Product Version</w:t>
       </w:r>
       <w:r>
@@ -508,6 +532,7 @@
           <w:b/>
           <w:bCs/>
         </w:rPr>
+        <w:lastRenderedPageBreak/>
         <w:t>Software Configuration Management (SCM)</w:t>
       </w:r>
       <w:r>
@@ -548,7 +573,6 @@
         </w:numPr>
       </w:pPr>
       <w:r>
-        <w:lastRenderedPageBreak/>
         <w:t>Code Change/Non-code Change: Non-Code Change</w:t>
       </w:r>
     </w:p>
@@ -798,6 +822,7 @@
           <w:b/>
           <w:bCs/>
         </w:rPr>
+        <w:lastRenderedPageBreak/>
         <w:t>Software Configuration Management (SCM)</w:t>
       </w:r>
       <w:r>
@@ -838,7 +863,6 @@
         </w:numPr>
       </w:pPr>
       <w:r>
-        <w:lastRenderedPageBreak/>
         <w:t>Code Change/Non-code Change: Non-Code Change</w:t>
       </w:r>
     </w:p>
@@ -1050,6 +1074,7 @@
           <w:b/>
           <w:bCs/>
         </w:rPr>
+        <w:lastRenderedPageBreak/>
         <w:t>Defect Summary</w:t>
       </w:r>
       <w:r>
@@ -1071,7 +1096,6 @@
           <w:b/>
           <w:bCs/>
         </w:rPr>
-        <w:lastRenderedPageBreak/>
         <w:t>Assigned / Investigating Evidence Summary</w:t>
       </w:r>
       <w:r>
@@ -1310,6 +1334,7 @@
       </w:r>
       <w:proofErr w:type="spellStart"/>
       <w:r>
+        <w:lastRenderedPageBreak/>
         <w:t>AlgorithmFailureCount</w:t>
       </w:r>
       <w:proofErr w:type="spellEnd"/>
@@ -1338,7 +1363,6 @@
         </w:numPr>
       </w:pPr>
       <w:r>
-        <w:lastRenderedPageBreak/>
         <w:t>Hypothesis: the algorithm failure count/limit was set to 0; recommended increasing to default 9.</w:t>
       </w:r>
     </w:p>
@@ -1571,7 +1595,11 @@
       </w:r>
       <w:proofErr w:type="spellEnd"/>
       <w:r>
-        <w:t xml:space="preserve"> Error 1” when viewing a control objective in PCWS (RTE V14.4 CP1). Initial troubleshooting attempts failed. Diagnostics were requested (set Diagnostic Output Level </w:t>
+        <w:t xml:space="preserve"> Error 1” when viewing a control objective in PCWS (RTE V14.4 CP1). Initial </w:t>
+      </w:r>
+      <w:r>
+        <w:lastRenderedPageBreak/>
+        <w:t xml:space="preserve">troubleshooting attempts failed. Diagnostics were requested (set Diagnostic Output Level </w:t>
       </w:r>
       <w:proofErr w:type="spellStart"/>
       <w:r>
@@ -1604,7 +1632,6 @@
           <w:b/>
           <w:bCs/>
         </w:rPr>
-        <w:lastRenderedPageBreak/>
         <w:t>Assigned / Investigating Evidence Summary</w:t>
       </w:r>
       <w:r>
@@ -1700,6 +1727,30 @@
     </w:p>
     <w:p>
       <w:r>
+        <w:t xml:space="preserve">QIAN, </w:t>
+      </w:r>
+      <w:proofErr w:type="spellStart"/>
+      <w:r>
+        <w:t>Yinjue</w:t>
+      </w:r>
+      <w:proofErr w:type="spellEnd"/>
+      <w:r>
+        <w:t>:</w:t>
+      </w:r>
+    </w:p>
+    <w:p>
+      <w:r>
+        <w:rPr>
+          <w:highlight w:val="yellow"/>
+        </w:rPr>
+        <w:t>Hi Yibo, the generated root cause is quite common, it may provide some directions for the defect fixing, however, it seems not so useful.</w:t>
+      </w:r>
+      <w:r>
+        <w:t> </w:t>
+      </w:r>
+    </w:p>
+    <w:p>
+      <w:r>
         <w:pict w14:anchorId="3E5F805F">
           <v:rect id="_x0000_i1031" style="width:0;height:1.5pt" o:hralign="center" o:hrstd="t" o:hr="t" fillcolor="#a0a0a0" stroked="f"/>
         </w:pict>
@@ -1792,6 +1843,7 @@
         </w:numPr>
       </w:pPr>
       <w:r>
+        <w:lastRenderedPageBreak/>
         <w:t>Code Change/Non-code Change: Non-Code Change</w:t>
       </w:r>
     </w:p>
@@ -1829,7 +1881,6 @@
         </w:numPr>
       </w:pPr>
       <w:r>
-        <w:lastRenderedPageBreak/>
         <w:t>Reviewer request (“Please help to review this”).</w:t>
       </w:r>
     </w:p>
@@ -2013,6 +2064,7 @@
           <w:b/>
           <w:bCs/>
         </w:rPr>
+        <w:lastRenderedPageBreak/>
         <w:t>Software Configuration Management (SCM)</w:t>
       </w:r>
       <w:r>
@@ -2066,11 +2118,7 @@
       </w:r>
       <w:r>
         <w:br/>
-        <w:t xml:space="preserve">Customer experiences Aspen Plus GUI crash when opening/importing a summary (.sum) file, especially when importing into a blank simulation. Investigation indicates the crash is related to a calculator block results/initialization behavior: importing the summary into a blank simulation triggers the crash, while </w:t>
-      </w:r>
-      <w:r>
-        <w:lastRenderedPageBreak/>
-        <w:t xml:space="preserve">opening the </w:t>
+        <w:t xml:space="preserve">Customer experiences Aspen Plus GUI crash when opening/importing a summary (.sum) file, especially when importing into a blank simulation. Investigation indicates the crash is related to a calculator block results/initialization behavior: importing the summary into a blank simulation triggers the crash, while opening the </w:t>
       </w:r>
       <w:proofErr w:type="gramStart"/>
       <w:r>
@@ -2262,6 +2310,7 @@
           <w:b/>
           <w:bCs/>
         </w:rPr>
+        <w:lastRenderedPageBreak/>
         <w:t>Software Configuration Management (SCM)</w:t>
       </w:r>
       <w:r>
@@ -2315,11 +2364,7 @@
       </w:r>
       <w:r>
         <w:br/>
-        <w:t xml:space="preserve">A previously stable case begins showing a long Usability Standards / UMSGTEXT message and the application locks up, requiring termination via task manager. Investigation could not reproduce using the customer’s steps, but the behavior could be triggered by running a command like &lt;MUMSG OK ERROR1 </w:t>
-      </w:r>
-      <w:r>
-        <w:lastRenderedPageBreak/>
-        <w:t>without a third argument. Investigation suggests the issue stems from customized rules that failed to supply the required third argument; UI includes a close icon that can dismiss the message.</w:t>
+        <w:t>A previously stable case begins showing a long Usability Standards / UMSGTEXT message and the application locks up, requiring termination via task manager. Investigation could not reproduce using the customer’s steps, but the behavior could be triggered by running a command like &lt;MUMSG OK ERROR1 without a third argument. Investigation suggests the issue stems from customized rules that failed to supply the required third argument; UI includes a close icon that can dismiss the message.</w:t>
       </w:r>
     </w:p>
     <w:p>
@@ -2453,6 +2498,39 @@
       </w:r>
     </w:p>
     <w:p>
+      <w:r>
+        <w:t>Sun, Peng</w:t>
+      </w:r>
+      <w:r>
+        <w:rPr>
+          <w:rFonts w:hint="eastAsia"/>
+        </w:rPr>
+        <w:t>:</w:t>
+      </w:r>
+    </w:p>
+    <w:p>
+      <w:r>
+        <w:rPr>
+          <w:highlight w:val="yellow"/>
+        </w:rPr>
+        <w:t xml:space="preserve">Sorry for the </w:t>
+      </w:r>
+      <w:proofErr w:type="gramStart"/>
+      <w:r>
+        <w:rPr>
+          <w:highlight w:val="yellow"/>
+        </w:rPr>
+        <w:t>delay</w:t>
+      </w:r>
+      <w:proofErr w:type="gramEnd"/>
+      <w:r>
+        <w:rPr>
+          <w:highlight w:val="yellow"/>
+        </w:rPr>
+        <w:t xml:space="preserve"> reply as I am on vacation these days. I think the summary is correct for this defect. Good job.</w:t>
+      </w:r>
+    </w:p>
+    <w:p>
       <w:pPr>
         <w:rPr>
           <w:b/>
@@ -2487,6 +2565,7 @@
           <w:b/>
           <w:bCs/>
         </w:rPr>
+        <w:lastRenderedPageBreak/>
         <w:t>Product Name</w:t>
       </w:r>
       <w:r>
@@ -2566,11 +2645,7 @@
       </w:r>
       <w:r>
         <w:br/>
-        <w:t xml:space="preserve">Customer sees run-time error -2146234304 (80131040) when launching PID Watch (and similarly IQ </w:t>
-      </w:r>
-      <w:r>
-        <w:lastRenderedPageBreak/>
-        <w:t xml:space="preserve">Config) on a Windows 11 Pro laptop. The environment appears to have mixed-version components (mentions SLM v15 installed on the same machine), and prior similar cases were resolved by restoring/repairing HTML Help / ActiveX dependencies. A specific workaround points to missing/unregistered Aspen </w:t>
+        <w:t xml:space="preserve">Customer sees run-time error -2146234304 (80131040) when launching PID Watch (and similarly IQ Config) on a Windows 11 Pro laptop. The environment appears to have mixed-version components (mentions SLM v15 installed on the same machine), and prior similar cases were resolved by restoring/repairing HTML Help / ActiveX dependencies. A specific workaround points to missing/unregistered Aspen </w:t>
       </w:r>
       <w:proofErr w:type="spellStart"/>
       <w:r>
@@ -2714,6 +2789,31 @@
     </w:p>
     <w:p>
       <w:r>
+        <w:t xml:space="preserve">QIAN, </w:t>
+      </w:r>
+      <w:proofErr w:type="spellStart"/>
+      <w:r>
+        <w:t>Yinjue</w:t>
+      </w:r>
+      <w:proofErr w:type="spellEnd"/>
+      <w:r>
+        <w:t>:</w:t>
+      </w:r>
+    </w:p>
+    <w:p>
+      <w:r>
+        <w:rPr>
+          <w:highlight w:val="yellow"/>
+        </w:rPr>
+        <w:lastRenderedPageBreak/>
+        <w:t>Hi Yibo, the generated root cause is quite common, it may provide some directions for the defect fixing, however, it seems not so useful.</w:t>
+      </w:r>
+      <w:r>
+        <w:t> </w:t>
+      </w:r>
+    </w:p>
+    <w:p>
+      <w:r>
         <w:pict w14:anchorId="04901DE8">
           <v:rect id="_x0000_i1035" style="width:0;height:1.5pt" o:hralign="center" o:hrstd="t" o:hr="t" fillcolor="#a0a0a0" stroked="f"/>
         </w:pict>
@@ -2819,11 +2919,7 @@
       </w:r>
       <w:r>
         <w:br/>
-        <w:t xml:space="preserve">During a roll-forward procedure for an Aspen Supply Chain Management PS model, customer hit an </w:t>
-      </w:r>
-      <w:r>
-        <w:lastRenderedPageBreak/>
-        <w:t xml:space="preserve">unusual error involving usync.exe, described as linking to “Just-in-time associated with Visual Studio.” Internal note indicates this executable is not from </w:t>
+        <w:t xml:space="preserve">During a roll-forward procedure for an Aspen Supply Chain Management PS model, customer hit an unusual error involving usync.exe, described as linking to “Just-in-time associated with Visual Studio.” Internal note indicates this executable is not from </w:t>
       </w:r>
       <w:proofErr w:type="spellStart"/>
       <w:r>
@@ -2967,6 +3063,7 @@
           <w:b/>
           <w:bCs/>
         </w:rPr>
+        <w:lastRenderedPageBreak/>
         <w:t>Product Name</w:t>
       </w:r>
       <w:r>
@@ -3094,7 +3191,6 @@
         </w:numPr>
       </w:pPr>
       <w:r>
-        <w:lastRenderedPageBreak/>
         <w:t>Hypothesis: excessive memory usage by DMC3Builder.exe causing intermittent crash; consistent with large application + slow behavior + 32-bit memory constraints.</w:t>
       </w:r>
     </w:p>
@@ -3189,6 +3285,7 @@
           <w:b/>
           <w:bCs/>
         </w:rPr>
+        <w:lastRenderedPageBreak/>
         <w:t>Product Name</w:t>
       </w:r>
       <w:r>
@@ -3277,7 +3374,6 @@
           <w:b/>
           <w:bCs/>
         </w:rPr>
-        <w:lastRenderedPageBreak/>
         <w:t>Assigned / Investigating Evidence Summary</w:t>
       </w:r>
       <w:r>
@@ -3395,6 +3491,7 @@
           <w:b/>
           <w:bCs/>
         </w:rPr>
+        <w:lastRenderedPageBreak/>
         <w:t>Product Name</w:t>
       </w:r>
       <w:r>
@@ -3483,7 +3580,6 @@
           <w:b/>
           <w:bCs/>
         </w:rPr>
-        <w:lastRenderedPageBreak/>
         <w:t>Assigned / Investigating Evidence Summary</w:t>
       </w:r>
       <w:r>
@@ -3620,6 +3716,7 @@
           <w:bCs/>
           <w:highlight w:val="green"/>
         </w:rPr>
+        <w:lastRenderedPageBreak/>
         <w:t>16) Defect ID: 1597323</w:t>
       </w:r>
     </w:p>
@@ -3746,7 +3843,6 @@
           <w:b/>
           <w:bCs/>
         </w:rPr>
-        <w:lastRenderedPageBreak/>
         <w:t>Assigned / Investigating Evidence Summary</w:t>
       </w:r>
     </w:p>
@@ -3886,12 +3982,46 @@
     </w:p>
     <w:p>
       <w:r>
+        <w:lastRenderedPageBreak/>
         <w:t>Logs clearly demonstrate host-level disconnection events originating from APC/RTE side. GDOT behavior (skipping cycles and turning off optimizer after threshold) is consistent with its designed safety logic.</w:t>
       </w:r>
     </w:p>
     <w:p>
       <w:r>
         <w:t>Conclusion that this is not a GDOT defect is well supported.</w:t>
+      </w:r>
+    </w:p>
+    <w:p>
+      <w:r>
+        <w:t>Liu, Jessica</w:t>
+      </w:r>
+      <w:r>
+        <w:rPr>
+          <w:rFonts w:hint="eastAsia"/>
+        </w:rPr>
+        <w:t>:</w:t>
+      </w:r>
+    </w:p>
+    <w:p>
+      <w:r>
+        <w:rPr>
+          <w:highlight w:val="yellow"/>
+        </w:rPr>
+        <w:t xml:space="preserve">Conclusion that this is not a GDOT defect is well supported." </w:t>
+      </w:r>
+      <w:proofErr w:type="gramStart"/>
+      <w:r>
+        <w:rPr>
+          <w:highlight w:val="yellow"/>
+        </w:rPr>
+        <w:t>this</w:t>
+      </w:r>
+      <w:proofErr w:type="gramEnd"/>
+      <w:r>
+        <w:rPr>
+          <w:highlight w:val="yellow"/>
+        </w:rPr>
+        <w:t xml:space="preserve"> sentence seems to have a grammar error</w:t>
       </w:r>
     </w:p>
     <w:p>
@@ -4009,7 +4139,6 @@
     </w:p>
     <w:p>
       <w:r>
-        <w:lastRenderedPageBreak/>
         <w:t xml:space="preserve">GDOT optimizer turns OFF after 30–60 minutes due to “OUT OF MEMORY” error. Event Viewer shows .NET Runtime error involving GDOTdatabaseintegration.exe. Server memory usage overall is moderate (37%, 265GB/300GB). Customer noticed </w:t>
       </w:r>
       <w:proofErr w:type="spellStart"/>
@@ -4130,6 +4259,7 @@
           <w:b/>
           <w:bCs/>
         </w:rPr>
+        <w:lastRenderedPageBreak/>
         <w:t>Evaluation</w:t>
       </w:r>
     </w:p>
@@ -4169,6 +4299,64 @@
     </w:p>
     <w:p>
       <w:r>
+        <w:t>Polisetty, Pradeep</w:t>
+      </w:r>
+      <w:r>
+        <w:t>:</w:t>
+      </w:r>
+    </w:p>
+    <w:p>
+      <w:r>
+        <w:rPr>
+          <w:highlight w:val="yellow"/>
+        </w:rPr>
+        <w:t xml:space="preserve">No, this is not correct interpretation of the root cause. </w:t>
+      </w:r>
+      <w:proofErr w:type="gramStart"/>
+      <w:r>
+        <w:rPr>
+          <w:highlight w:val="yellow"/>
+        </w:rPr>
+        <w:t>Unfortunately</w:t>
+      </w:r>
+      <w:proofErr w:type="gramEnd"/>
+      <w:r>
+        <w:rPr>
+          <w:highlight w:val="yellow"/>
+        </w:rPr>
+        <w:t xml:space="preserve"> two issues from completely different products were discussed in this defect so I don’t think this is </w:t>
+      </w:r>
+      <w:proofErr w:type="gramStart"/>
+      <w:r>
+        <w:rPr>
+          <w:highlight w:val="yellow"/>
+        </w:rPr>
+        <w:t>a right</w:t>
+      </w:r>
+      <w:proofErr w:type="gramEnd"/>
+      <w:r>
+        <w:rPr>
+          <w:highlight w:val="yellow"/>
+        </w:rPr>
+        <w:t xml:space="preserve"> defect to analyze. More than that it just summarized the topics under </w:t>
+      </w:r>
+      <w:proofErr w:type="gramStart"/>
+      <w:r>
+        <w:rPr>
+          <w:highlight w:val="yellow"/>
+        </w:rPr>
+        <w:t>discussion section</w:t>
+      </w:r>
+      <w:proofErr w:type="gramEnd"/>
+      <w:r>
+        <w:rPr>
+          <w:highlight w:val="yellow"/>
+        </w:rPr>
+        <w:t xml:space="preserve"> without giving any useful additional information.</w:t>
+      </w:r>
+    </w:p>
+    <w:p>
+      <w:r>
         <w:pict w14:anchorId="598F3353">
           <v:rect id="_x0000_i1041" style="width:0;height:1.5pt" o:hralign="center" o:hrstd="t" o:hr="t" fillcolor="#a0a0a0" stroked="f"/>
         </w:pict>
@@ -4277,7 +4465,6 @@
           <w:b/>
           <w:bCs/>
         </w:rPr>
-        <w:lastRenderedPageBreak/>
         <w:t>Defect Summary</w:t>
       </w:r>
     </w:p>
@@ -4362,6 +4549,7 @@
         </w:numPr>
       </w:pPr>
       <w:r>
+        <w:lastRenderedPageBreak/>
         <w:t>Duplicates visible in validation report.</w:t>
       </w:r>
     </w:p>
@@ -4445,6 +4633,58 @@
         <w:t>Concurrency validation limitation rather than database corruption.</w:t>
       </w:r>
     </w:p>
+    <w:p/>
+    <w:p>
+      <w:r>
+        <w:rPr>
+          <w:b/>
+          <w:bCs/>
+        </w:rPr>
+        <w:t>Chapin, Chris</w:t>
+      </w:r>
+      <w:r>
+        <w:t>:</w:t>
+      </w:r>
+    </w:p>
+    <w:p>
+      <w:r>
+        <w:rPr>
+          <w:highlight w:val="yellow"/>
+        </w:rPr>
+        <w:t xml:space="preserve">Defect </w:t>
+      </w:r>
+      <w:r>
+        <w:rPr>
+          <w:b/>
+          <w:bCs/>
+          <w:highlight w:val="yellow"/>
+        </w:rPr>
+        <w:t>1599291</w:t>
+      </w:r>
+      <w:r>
+        <w:rPr>
+          <w:highlight w:val="yellow"/>
+        </w:rPr>
+        <w:t xml:space="preserve"> was working by design, I don't remember why we didn't just close it. I think we just wanted QE to do some testing in that area to make sure nothing unexpected was </w:t>
+      </w:r>
+      <w:proofErr w:type="gramStart"/>
+      <w:r>
+        <w:rPr>
+          <w:highlight w:val="yellow"/>
+        </w:rPr>
+        <w:t>actually happening</w:t>
+      </w:r>
+      <w:proofErr w:type="gramEnd"/>
+      <w:r>
+        <w:rPr>
+          <w:highlight w:val="yellow"/>
+        </w:rPr>
+        <w:t>. The LLM generated root cause is OK I think, it says behavior may be by design, which is true.</w:t>
+      </w:r>
+      <w:r>
+        <w:t> </w:t>
+      </w:r>
+    </w:p>
     <w:p>
       <w:r>
         <w:pict w14:anchorId="38A91516">
@@ -4555,56 +4795,56 @@
           <w:b/>
           <w:bCs/>
         </w:rPr>
+        <w:t>Defect Summary</w:t>
+      </w:r>
+    </w:p>
+    <w:p>
+      <w:r>
+        <w:t xml:space="preserve">HYSYS V15 freezes when adding external streams within a </w:t>
+      </w:r>
+      <w:proofErr w:type="spellStart"/>
+      <w:r>
+        <w:t>Selexol</w:t>
+      </w:r>
+      <w:proofErr w:type="spellEnd"/>
+      <w:r>
+        <w:t xml:space="preserve"> </w:t>
+      </w:r>
+      <w:proofErr w:type="spellStart"/>
+      <w:r>
+        <w:t>subflowsheet</w:t>
+      </w:r>
+      <w:proofErr w:type="spellEnd"/>
+      <w:r>
+        <w:t xml:space="preserve"> connection. Solver remains in “</w:t>
+      </w:r>
+      <w:proofErr w:type="spellStart"/>
+      <w:r>
+        <w:t>Main_Solver_Active</w:t>
+      </w:r>
+      <w:proofErr w:type="spellEnd"/>
+      <w:r>
+        <w:t>” state. In some cases, main flowsheet disappears after switching tabs. Issue reproducible in V15.0 but not in V15.2.</w:t>
+      </w:r>
+    </w:p>
+    <w:p>
+      <w:pPr>
+        <w:rPr>
+          <w:b/>
+          <w:bCs/>
+        </w:rPr>
+      </w:pPr>
+      <w:r>
+        <w:rPr>
+          <w:b/>
+          <w:bCs/>
+        </w:rPr>
+        <w:t>Assigned / Investigating Evidence Summary</w:t>
+      </w:r>
+    </w:p>
+    <w:p>
+      <w:r>
         <w:lastRenderedPageBreak/>
-        <w:t>Defect Summary</w:t>
-      </w:r>
-    </w:p>
-    <w:p>
-      <w:r>
-        <w:t xml:space="preserve">HYSYS V15 freezes when adding external streams within a </w:t>
-      </w:r>
-      <w:proofErr w:type="spellStart"/>
-      <w:r>
-        <w:t>Selexol</w:t>
-      </w:r>
-      <w:proofErr w:type="spellEnd"/>
-      <w:r>
-        <w:t xml:space="preserve"> </w:t>
-      </w:r>
-      <w:proofErr w:type="spellStart"/>
-      <w:r>
-        <w:t>subflowsheet</w:t>
-      </w:r>
-      <w:proofErr w:type="spellEnd"/>
-      <w:r>
-        <w:t xml:space="preserve"> connection. Solver remains in “</w:t>
-      </w:r>
-      <w:proofErr w:type="spellStart"/>
-      <w:r>
-        <w:t>Main_Solver_Active</w:t>
-      </w:r>
-      <w:proofErr w:type="spellEnd"/>
-      <w:r>
-        <w:t>” state. In some cases, main flowsheet disappears after switching tabs. Issue reproducible in V15.0 but not in V15.2.</w:t>
-      </w:r>
-    </w:p>
-    <w:p>
-      <w:pPr>
-        <w:rPr>
-          <w:b/>
-          <w:bCs/>
-        </w:rPr>
-      </w:pPr>
-      <w:r>
-        <w:rPr>
-          <w:b/>
-          <w:bCs/>
-        </w:rPr>
-        <w:t>Assigned / Investigating Evidence Summary</w:t>
-      </w:r>
-    </w:p>
-    <w:p>
-      <w:r>
         <w:t>Assigned investigation concluded:</w:t>
       </w:r>
     </w:p>
@@ -4750,6 +4990,41 @@
     </w:p>
     <w:p>
       <w:r>
+        <w:t>Lara, Ricardo</w:t>
+      </w:r>
+      <w:r>
+        <w:t>:</w:t>
+      </w:r>
+    </w:p>
+    <w:p>
+      <w:r>
+        <w:t>Hi Yibo,</w:t>
+      </w:r>
+    </w:p>
+    <w:p>
+      <w:r>
+        <w:rPr>
+          <w:highlight w:val="yellow"/>
+        </w:rPr>
+        <w:t xml:space="preserve">The issue was with the connections rather than with the unit operation of the SET. They worked at first, but the case became corrupted for some reason we don’t know, so we couldn’t generalize that SET only works outside of </w:t>
+      </w:r>
+      <w:proofErr w:type="spellStart"/>
+      <w:r>
+        <w:rPr>
+          <w:highlight w:val="yellow"/>
+        </w:rPr>
+        <w:t>subflowsheets</w:t>
+      </w:r>
+      <w:proofErr w:type="spellEnd"/>
+      <w:r>
+        <w:rPr>
+          <w:highlight w:val="yellow"/>
+        </w:rPr>
+        <w:t>.</w:t>
+      </w:r>
+    </w:p>
+    <w:p>
+      <w:r>
         <w:pict w14:anchorId="6142FF99">
           <v:rect id="_x0000_i1043" style="width:0;height:1.5pt" o:hralign="center" o:hrstd="t" o:hr="t" fillcolor="#a0a0a0" stroked="f"/>
         </w:pict>
@@ -4997,6 +5272,30 @@
     </w:p>
     <w:p>
       <w:r>
+        <w:t xml:space="preserve">QIAN, </w:t>
+      </w:r>
+      <w:proofErr w:type="spellStart"/>
+      <w:r>
+        <w:t>Yinjue</w:t>
+      </w:r>
+      <w:proofErr w:type="spellEnd"/>
+      <w:r>
+        <w:t>:</w:t>
+      </w:r>
+    </w:p>
+    <w:p>
+      <w:r>
+        <w:rPr>
+          <w:highlight w:val="yellow"/>
+        </w:rPr>
+        <w:t>Hi Yibo, the generated root cause is quite common, it may provide some directions for the defect fixing, however, it seems not so useful.</w:t>
+      </w:r>
+      <w:r>
+        <w:t> </w:t>
+      </w:r>
+    </w:p>
+    <w:p>
+      <w:r>
         <w:pict w14:anchorId="33F31A80">
           <v:rect id="_x0000_i1044" style="width:0;height:1.5pt" o:hralign="center" o:hrstd="t" o:hr="t" fillcolor="#a0a0a0" stroked="f"/>
         </w:pict>
@@ -5110,6 +5409,7 @@
     </w:p>
     <w:p>
       <w:r>
+        <w:lastRenderedPageBreak/>
         <w:t>Customer reported high memory usage from Microsoft Edge when plots (IP21 trends / controller plots) were left open for extended periods (~12 hours) on the DMC server. Edge memory consumption reportedly increased up to 8 GB, eventually exhausting the 16 GB VM memory and causing the RTE service to crash. RTEService.exe itself remained stable (~2.7 GB).</w:t>
       </w:r>
     </w:p>
@@ -5125,7 +5425,6 @@
           <w:b/>
           <w:bCs/>
         </w:rPr>
-        <w:lastRenderedPageBreak/>
         <w:t>Assigned / Investigating Evidence Summary</w:t>
       </w:r>
     </w:p>
@@ -5344,6 +5643,30 @@
     </w:p>
     <w:p>
       <w:r>
+        <w:t xml:space="preserve">QIAN, </w:t>
+      </w:r>
+      <w:proofErr w:type="spellStart"/>
+      <w:r>
+        <w:t>Yinjue</w:t>
+      </w:r>
+      <w:proofErr w:type="spellEnd"/>
+      <w:r>
+        <w:t>:</w:t>
+      </w:r>
+    </w:p>
+    <w:p>
+      <w:r>
+        <w:rPr>
+          <w:highlight w:val="yellow"/>
+        </w:rPr>
+        <w:t>Hi Yibo, the generated root cause is quite common, it may provide some directions for the defect fixing, however, it seems not so useful.</w:t>
+      </w:r>
+      <w:r>
+        <w:t> </w:t>
+      </w:r>
+    </w:p>
+    <w:p>
+      <w:r>
         <w:pict w14:anchorId="78108865">
           <v:rect id="_x0000_i1045" style="width:0;height:1.5pt" o:hralign="center" o:hrstd="t" o:hr="t" fillcolor="#a0a0a0" stroked="f"/>
         </w:pict>
@@ -5362,6 +5685,7 @@
           <w:bCs/>
           <w:highlight w:val="green"/>
         </w:rPr>
+        <w:lastRenderedPageBreak/>
         <w:t>22) Defect ID: 1601132</w:t>
       </w:r>
     </w:p>
@@ -5410,7 +5734,6 @@
           <w:b/>
           <w:bCs/>
         </w:rPr>
-        <w:lastRenderedPageBreak/>
         <w:t>Code Change Classification</w:t>
       </w:r>
     </w:p>
@@ -5652,6 +5975,51 @@
     </w:p>
     <w:p>
       <w:r>
+        <w:t>Elliott, Jon</w:t>
+      </w:r>
+      <w:r>
+        <w:t>:</w:t>
+      </w:r>
+    </w:p>
+    <w:p>
+      <w:r>
+        <w:rPr>
+          <w:highlight w:val="yellow"/>
+        </w:rPr>
+        <w:lastRenderedPageBreak/>
+        <w:t xml:space="preserve">These look like </w:t>
+      </w:r>
+      <w:proofErr w:type="gramStart"/>
+      <w:r>
+        <w:rPr>
+          <w:highlight w:val="yellow"/>
+        </w:rPr>
+        <w:t>the they</w:t>
+      </w:r>
+      <w:proofErr w:type="gramEnd"/>
+      <w:r>
+        <w:rPr>
+          <w:highlight w:val="yellow"/>
+        </w:rPr>
+        <w:t xml:space="preserve"> are accurate. </w:t>
+      </w:r>
+      <w:proofErr w:type="spellStart"/>
+      <w:r>
+        <w:rPr>
+          <w:highlight w:val="yellow"/>
+        </w:rPr>
+        <w:t>Interecting</w:t>
+      </w:r>
+      <w:proofErr w:type="spellEnd"/>
+      <w:r>
+        <w:rPr>
+          <w:highlight w:val="yellow"/>
+        </w:rPr>
+        <w:t>.</w:t>
+      </w:r>
+    </w:p>
+    <w:p>
+      <w:r>
         <w:pict w14:anchorId="6CA39A77">
           <v:rect id="_x0000_i1046" style="width:0;height:1.5pt" o:hralign="center" o:hrstd="t" o:hr="t" fillcolor="#a0a0a0" stroked="f"/>
         </w:pict>
@@ -5725,7 +6093,6 @@
           <w:b/>
           <w:bCs/>
         </w:rPr>
-        <w:lastRenderedPageBreak/>
         <w:t>Code Change Classification</w:t>
       </w:r>
     </w:p>
@@ -5973,6 +6340,7 @@
     </w:p>
     <w:p>
       <w:r>
+        <w:lastRenderedPageBreak/>
         <w:t>Strong, code-level defect with reproducible behavior and confirmed fix.</w:t>
       </w:r>
     </w:p>
@@ -6043,6 +6411,25 @@
     </w:p>
     <w:p>
       <w:r>
+        <w:t>Dominguez, Alejandro</w:t>
+      </w:r>
+      <w:r>
+        <w:t>:</w:t>
+      </w:r>
+    </w:p>
+    <w:p>
+      <w:r>
+        <w:rPr>
+          <w:highlight w:val="yellow"/>
+        </w:rPr>
+        <w:t>Hi Yibo, the root cause is correct.</w:t>
+      </w:r>
+      <w:r>
+        <w:t> </w:t>
+      </w:r>
+    </w:p>
+    <w:p>
+      <w:r>
         <w:pict w14:anchorId="1210012C">
           <v:rect id="_x0000_i1047" style="width:0;height:1.5pt" o:hralign="center" o:hrstd="t" o:hr="t" fillcolor="#a0a0a0" stroked="f"/>
         </w:pict>
@@ -6055,21 +6442,12 @@
           <w:bCs/>
         </w:rPr>
       </w:pPr>
-    </w:p>
-    <w:p>
-      <w:pPr>
-        <w:rPr>
-          <w:b/>
-          <w:bCs/>
-        </w:rPr>
-      </w:pPr>
       <w:r>
         <w:rPr>
           <w:b/>
           <w:bCs/>
           <w:highlight w:val="green"/>
         </w:rPr>
-        <w:lastRenderedPageBreak/>
         <w:t>24) Defect ID: 1610614</w:t>
       </w:r>
     </w:p>
@@ -6290,6 +6668,7 @@
         <w:ind w:left="720"/>
       </w:pPr>
       <w:r>
+        <w:lastRenderedPageBreak/>
         <w:t>/d "* 4096"</w:t>
       </w:r>
     </w:p>
@@ -6400,7 +6779,6 @@
         </w:numPr>
       </w:pPr>
       <w:r>
-        <w:lastRenderedPageBreak/>
         <w:t>Known KB solution applied.</w:t>
       </w:r>
     </w:p>
@@ -6422,6 +6800,85 @@
     </w:p>
     <w:p>
       <w:r>
+        <w:t>Song, Yuhua</w:t>
+      </w:r>
+      <w:r>
+        <w:rPr>
+          <w:rFonts w:hint="eastAsia"/>
+        </w:rPr>
+        <w:t>:</w:t>
+      </w:r>
+    </w:p>
+    <w:p>
+      <w:pPr>
+        <w:rPr>
+          <w:highlight w:val="yellow"/>
+        </w:rPr>
+      </w:pPr>
+      <w:r>
+        <w:rPr>
+          <w:highlight w:val="yellow"/>
+        </w:rPr>
+        <w:t xml:space="preserve">Hi Yibo. </w:t>
+      </w:r>
+      <w:r>
+        <w:rPr>
+          <w:b/>
+          <w:bCs/>
+          <w:highlight w:val="yellow"/>
+        </w:rPr>
+        <w:t xml:space="preserve">Defect ID: 1610614 looks good but Defect ID: 1615252 needs some modifications. We've already provided a new V15 media to the customer; see </w:t>
+      </w:r>
+      <w:hyperlink r:id="rId5" w:tgtFrame="_blank" w:tooltip="https://aspentech-alm.visualstudio.com/aspentech/_workitems/edit/1703010" w:history="1">
+        <w:r>
+          <w:rPr>
+            <w:rStyle w:val="Hyperlink"/>
+            <w:highlight w:val="yellow"/>
+          </w:rPr>
+          <w:t>https://aspentech-alm.visualstudio.com/AspenTech/_workitems/edit/1703010</w:t>
+        </w:r>
+      </w:hyperlink>
+    </w:p>
+    <w:p>
+      <w:r>
+        <w:rPr>
+          <w:highlight w:val="yellow"/>
+        </w:rPr>
+        <w:t xml:space="preserve">Another point is we should not say </w:t>
+      </w:r>
+      <w:r>
+        <w:rPr>
+          <w:b/>
+          <w:bCs/>
+          <w:highlight w:val="yellow"/>
+        </w:rPr>
+        <w:t xml:space="preserve">next release scheduled May </w:t>
+      </w:r>
+      <w:proofErr w:type="gramStart"/>
+      <w:r>
+        <w:rPr>
+          <w:b/>
+          <w:bCs/>
+          <w:highlight w:val="yellow"/>
+        </w:rPr>
+        <w:t>2026</w:t>
+      </w:r>
+      <w:r>
+        <w:rPr>
+          <w:highlight w:val="yellow"/>
+        </w:rPr>
+        <w:t>..</w:t>
+      </w:r>
+      <w:proofErr w:type="gramEnd"/>
+      <w:r>
+        <w:rPr>
+          <w:highlight w:val="yellow"/>
+        </w:rPr>
+        <w:t xml:space="preserve"> Just next release.</w:t>
+      </w:r>
+    </w:p>
+    <w:p>
+      <w:r>
         <w:pict w14:anchorId="2DA930F3">
           <v:rect id="_x0000_i1048" style="width:0;height:1.5pt" o:hralign="center" o:hrstd="t" o:hr="t" fillcolor="#a0a0a0" stroked="f"/>
         </w:pict>
@@ -6546,6 +7003,7 @@
         </w:numPr>
       </w:pPr>
       <w:r>
+        <w:lastRenderedPageBreak/>
         <w:t xml:space="preserve">OOL (Out-of-Limits) correction values </w:t>
       </w:r>
       <w:proofErr w:type="gramStart"/>
@@ -6730,7 +7188,6 @@
         </w:numPr>
       </w:pPr>
       <w:r>
-        <w:lastRenderedPageBreak/>
         <w:t>Release strategy updated via CCB.</w:t>
       </w:r>
     </w:p>
@@ -6841,6 +7298,30 @@
     </w:p>
     <w:p>
       <w:r>
+        <w:t xml:space="preserve">QIAN, </w:t>
+      </w:r>
+      <w:proofErr w:type="spellStart"/>
+      <w:r>
+        <w:t>Yinjue</w:t>
+      </w:r>
+      <w:proofErr w:type="spellEnd"/>
+      <w:r>
+        <w:t>:</w:t>
+      </w:r>
+    </w:p>
+    <w:p>
+      <w:r>
+        <w:rPr>
+          <w:highlight w:val="yellow"/>
+        </w:rPr>
+        <w:t>Hi Yibo, the generated root cause is quite common, it may provide some directions for the defect fixing, however, it seems not so useful.</w:t>
+      </w:r>
+      <w:r>
+        <w:t> </w:t>
+      </w:r>
+    </w:p>
+    <w:p>
+      <w:r>
         <w:pict w14:anchorId="00AD7F66">
           <v:rect id="_x0000_i1049" style="width:0;height:1.5pt" o:hralign="center" o:hrstd="t" o:hr="t" fillcolor="#a0a0a0" stroked="f"/>
         </w:pict>
@@ -6859,6 +7340,7 @@
           <w:bCs/>
           <w:highlight w:val="green"/>
         </w:rPr>
+        <w:lastRenderedPageBreak/>
         <w:t>26) Defect ID: 1611200</w:t>
       </w:r>
     </w:p>
@@ -7020,7 +7502,6 @@
         </w:numPr>
       </w:pPr>
       <w:r>
-        <w:lastRenderedPageBreak/>
         <w:t>Support case and defect were requested to be closed; defect status closed.</w:t>
       </w:r>
     </w:p>
@@ -7087,6 +7568,50 @@
       </w:r>
       <w:r>
         <w:t xml:space="preserve"> preventing writes. No internal product change is indicated; closure is appropriate.</w:t>
+      </w:r>
+    </w:p>
+    <w:p>
+      <w:r>
+        <w:t>Elliott, Jon</w:t>
+      </w:r>
+      <w:r>
+        <w:t>:</w:t>
+      </w:r>
+    </w:p>
+    <w:p>
+      <w:r>
+        <w:rPr>
+          <w:highlight w:val="yellow"/>
+        </w:rPr>
+        <w:t xml:space="preserve">These look like </w:t>
+      </w:r>
+      <w:proofErr w:type="gramStart"/>
+      <w:r>
+        <w:rPr>
+          <w:highlight w:val="yellow"/>
+        </w:rPr>
+        <w:t>the they</w:t>
+      </w:r>
+      <w:proofErr w:type="gramEnd"/>
+      <w:r>
+        <w:rPr>
+          <w:highlight w:val="yellow"/>
+        </w:rPr>
+        <w:t xml:space="preserve"> are accurate. </w:t>
+      </w:r>
+      <w:proofErr w:type="spellStart"/>
+      <w:r>
+        <w:rPr>
+          <w:highlight w:val="yellow"/>
+        </w:rPr>
+        <w:t>Interecting</w:t>
+      </w:r>
+      <w:proofErr w:type="spellEnd"/>
+      <w:r>
+        <w:rPr>
+          <w:highlight w:val="yellow"/>
+        </w:rPr>
+        <w:t>.</w:t>
       </w:r>
     </w:p>
     <w:p>
@@ -7131,6 +7656,7 @@
           <w:b/>
           <w:bCs/>
         </w:rPr>
+        <w:lastRenderedPageBreak/>
         <w:t>Product Version</w:t>
       </w:r>
       <w:r>
@@ -7365,7 +7891,6 @@
     </w:p>
     <w:p>
       <w:r>
-        <w:lastRenderedPageBreak/>
         <w:t xml:space="preserve">Likely fixed defect in later release (V15.1) affecting </w:t>
       </w:r>
       <w:proofErr w:type="spellStart"/>
@@ -7492,6 +8017,7 @@
           <w:b/>
           <w:bCs/>
         </w:rPr>
+        <w:lastRenderedPageBreak/>
         <w:t>Product Name</w:t>
       </w:r>
       <w:r>
@@ -7689,7 +8215,6 @@
     </w:p>
     <w:p>
       <w:r>
-        <w:lastRenderedPageBreak/>
         <w:t>Not reproducible / no confirmed product defect (possible model-specific instability not validated)</w:t>
       </w:r>
     </w:p>
@@ -7726,6 +8251,25 @@
       </w:r>
       <w:r>
         <w:t>, closed due to non-reproducibility after triage.</w:t>
+      </w:r>
+    </w:p>
+    <w:p>
+      <w:r>
+        <w:t>Nasuti, Floyd</w:t>
+      </w:r>
+      <w:r>
+        <w:t>:</w:t>
+      </w:r>
+    </w:p>
+    <w:p>
+      <w:r>
+        <w:rPr>
+          <w:highlight w:val="yellow"/>
+        </w:rPr>
+        <w:t>Hi Yibo, I agree with the AI summary. Thanks</w:t>
+      </w:r>
+      <w:r>
+        <w:t> </w:t>
       </w:r>
     </w:p>
     <w:p>
@@ -7790,6 +8334,7 @@
           <w:b/>
           <w:bCs/>
         </w:rPr>
+        <w:lastRenderedPageBreak/>
         <w:t>Software Configuration Management (SCM)</w:t>
       </w:r>
       <w:r>
@@ -8044,7 +8589,6 @@
           <w:b/>
           <w:bCs/>
         </w:rPr>
-        <w:lastRenderedPageBreak/>
         <w:t>Evaluation</w:t>
       </w:r>
     </w:p>
@@ -8131,6 +8675,7 @@
           <w:b/>
           <w:bCs/>
         </w:rPr>
+        <w:lastRenderedPageBreak/>
         <w:t>Product Name</w:t>
       </w:r>
       <w:r>
@@ -8316,7 +8861,6 @@
         </w:numPr>
       </w:pPr>
       <w:r>
-        <w:lastRenderedPageBreak/>
         <w:t xml:space="preserve">Customer asked for workaround (e.g., uninstall SMO). Response: no workaround for restoring/registering new DB without it; asked if customer uses custom </w:t>
       </w:r>
       <w:proofErr w:type="spellStart"/>
@@ -8436,6 +8980,7 @@
         </w:numPr>
       </w:pPr>
       <w:r>
+        <w:lastRenderedPageBreak/>
         <w:t>Aspen provided a forward plan (dependency upgrade) with an explicit date (May 2026), but customer needs mitigation sooner.</w:t>
       </w:r>
     </w:p>
@@ -8481,7 +9026,85 @@
         <w:t xml:space="preserve"> for SMO upgrade if business priority demands, plus a standardized customer-facing statement on ESU responsibility and lifecycle interpretation to prevent recurrence.</w:t>
       </w:r>
     </w:p>
-    <w:p/>
+    <w:p>
+      <w:r>
+        <w:t>Song, Yuhua</w:t>
+      </w:r>
+      <w:r>
+        <w:rPr>
+          <w:rFonts w:hint="eastAsia"/>
+        </w:rPr>
+        <w:t>:</w:t>
+      </w:r>
+    </w:p>
+    <w:p>
+      <w:pPr>
+        <w:rPr>
+          <w:highlight w:val="yellow"/>
+        </w:rPr>
+      </w:pPr>
+      <w:r>
+        <w:rPr>
+          <w:highlight w:val="yellow"/>
+        </w:rPr>
+        <w:t xml:space="preserve">Hi Yibo. </w:t>
+      </w:r>
+      <w:r>
+        <w:rPr>
+          <w:b/>
+          <w:bCs/>
+          <w:highlight w:val="yellow"/>
+        </w:rPr>
+        <w:t xml:space="preserve">Defect ID: 1610614 looks good but Defect ID: 1615252 needs some modifications. We've already provided a new V15 media to the customer; see </w:t>
+      </w:r>
+      <w:hyperlink r:id="rId6" w:tgtFrame="_blank" w:tooltip="https://aspentech-alm.visualstudio.com/aspentech/_workitems/edit/1703010" w:history="1">
+        <w:r>
+          <w:rPr>
+            <w:rStyle w:val="Hyperlink"/>
+            <w:highlight w:val="yellow"/>
+          </w:rPr>
+          <w:t>https://aspentech-alm.visualstudio.com/AspenTech/_workitems/edit/1703010</w:t>
+        </w:r>
+      </w:hyperlink>
+    </w:p>
+    <w:p>
+      <w:r>
+        <w:rPr>
+          <w:highlight w:val="yellow"/>
+        </w:rPr>
+        <w:t xml:space="preserve"> Another point is we should not say </w:t>
+      </w:r>
+      <w:r>
+        <w:rPr>
+          <w:b/>
+          <w:bCs/>
+          <w:highlight w:val="yellow"/>
+        </w:rPr>
+        <w:t xml:space="preserve">next release scheduled May </w:t>
+      </w:r>
+      <w:proofErr w:type="gramStart"/>
+      <w:r>
+        <w:rPr>
+          <w:b/>
+          <w:bCs/>
+          <w:highlight w:val="yellow"/>
+        </w:rPr>
+        <w:t>2026</w:t>
+      </w:r>
+      <w:r>
+        <w:rPr>
+          <w:highlight w:val="yellow"/>
+        </w:rPr>
+        <w:t>..</w:t>
+      </w:r>
+      <w:proofErr w:type="gramEnd"/>
+      <w:r>
+        <w:rPr>
+          <w:highlight w:val="yellow"/>
+        </w:rPr>
+        <w:t xml:space="preserve"> Just next release.</w:t>
+      </w:r>
+    </w:p>
     <w:sectPr>
       <w:pgSz w:w="12240" w:h="15840"/>
       <w:pgMar w:top="720" w:right="720" w:bottom="720" w:left="720" w:header="720" w:footer="720" w:gutter="0"/>
@@ -22942,6 +23565,29 @@
       <w:spacing w:val="5"/>
     </w:rPr>
   </w:style>
+  <w:style w:type="character" w:styleId="Hyperlink">
+    <w:name w:val="Hyperlink"/>
+    <w:basedOn w:val="DefaultParagraphFont"/>
+    <w:uiPriority w:val="99"/>
+    <w:unhideWhenUsed/>
+    <w:rsid w:val="003D3251"/>
+    <w:rPr>
+      <w:color w:val="467886" w:themeColor="hyperlink"/>
+      <w:u w:val="single"/>
+    </w:rPr>
+  </w:style>
+  <w:style w:type="character" w:styleId="UnresolvedMention">
+    <w:name w:val="Unresolved Mention"/>
+    <w:basedOn w:val="DefaultParagraphFont"/>
+    <w:uiPriority w:val="99"/>
+    <w:semiHidden/>
+    <w:unhideWhenUsed/>
+    <w:rsid w:val="003D3251"/>
+    <w:rPr>
+      <w:color w:val="605E5C"/>
+      <w:shd w:val="clear" w:color="auto" w:fill="E1DFDD"/>
+    </w:rPr>
+  </w:style>
 </w:styles>
 </file>
 

</xml_diff>

<commit_message>
Add customer defect Stage 1 architecture slides and update analysis report
</commit_message>
<xml_diff>
--- a/backend/src/report/LLM_Root_Cause_Extraction_Assigned_Investigated_Cases_Analysis_2.docx
+++ b/backend/src/report/LLM_Root_Cause_Extraction_Assigned_Investigated_Cases_Analysis_2.docx
@@ -73,13 +73,8 @@
           <w:numId w:val="1"/>
         </w:numPr>
       </w:pPr>
-      <w:proofErr w:type="spellStart"/>
-      <w:r>
-        <w:t>CodeChange</w:t>
-      </w:r>
-      <w:proofErr w:type="spellEnd"/>
-      <w:r>
-        <w:t>: False</w:t>
+      <w:r>
+        <w:t>CodeChange: False</w:t>
       </w:r>
     </w:p>
     <w:p>
@@ -103,15 +98,7 @@
       </w:r>
       <w:r>
         <w:br/>
-        <w:t xml:space="preserve">RPL Wizard failed again, showing unreliable behavior such as “missing one RPL” or “up-versioning the same RPL twice.” The issue is reported as urgent for V14.5. </w:t>
-      </w:r>
-      <w:proofErr w:type="spellStart"/>
-      <w:r>
-        <w:t>Repro_steps</w:t>
-      </w:r>
-      <w:proofErr w:type="spellEnd"/>
-      <w:r>
-        <w:t xml:space="preserve"> indicate the failure can occur when the wizard is executed multiple times consecutively.</w:t>
+        <w:t>RPL Wizard failed again, showing unreliable behavior such as “missing one RPL” or “up-versioning the same RPL twice.” The issue is reported as urgent for V14.5. Repro_steps indicate the failure can occur when the wizard is executed multiple times consecutively.</w:t>
       </w:r>
     </w:p>
     <w:p>
@@ -135,15 +122,7 @@
         </w:numPr>
       </w:pPr>
       <w:r>
-        <w:t xml:space="preserve">Repeated observation that the wizard “forgot” one RPL and </w:t>
-      </w:r>
-      <w:proofErr w:type="gramStart"/>
-      <w:r>
-        <w:t>up-versioned</w:t>
-      </w:r>
-      <w:proofErr w:type="gramEnd"/>
-      <w:r>
-        <w:t xml:space="preserve"> the same RPL twice; logs appear normal; urgent in V14.5.</w:t>
+        <w:t>Repeated observation that the wizard “forgot” one RPL and up-versioned the same RPL twice; logs appear normal; urgent in V14.5.</w:t>
       </w:r>
     </w:p>
     <w:p>
@@ -159,15 +138,7 @@
     </w:p>
     <w:p>
       <w:r>
-        <w:t xml:space="preserve">Key facts from </w:t>
-      </w:r>
-      <w:proofErr w:type="spellStart"/>
-      <w:r>
-        <w:t>repro_steps</w:t>
-      </w:r>
-      <w:proofErr w:type="spellEnd"/>
-      <w:r>
-        <w:t>:</w:t>
+        <w:t>Key facts from repro_steps:</w:t>
       </w:r>
     </w:p>
     <w:p>
@@ -215,42 +186,13 @@
       </w:r>
       <w:r>
         <w:br/>
-        <w:t xml:space="preserve">Strong and </w:t>
-      </w:r>
-      <w:proofErr w:type="gramStart"/>
-      <w:r>
-        <w:t>evidence-based</w:t>
-      </w:r>
-      <w:proofErr w:type="gramEnd"/>
-      <w:r>
-        <w:t xml:space="preserve">. The root-cause statement is directly supported by </w:t>
-      </w:r>
-      <w:proofErr w:type="spellStart"/>
-      <w:r>
-        <w:t>repro_steps</w:t>
-      </w:r>
-      <w:proofErr w:type="spellEnd"/>
-      <w:r>
-        <w:t xml:space="preserve"> (“not resetting properly wizard context…”). Assigned notes mainly provide urgency and symptoms, but the </w:t>
-      </w:r>
-      <w:proofErr w:type="spellStart"/>
-      <w:r>
-        <w:t>repro_steps</w:t>
-      </w:r>
-      <w:proofErr w:type="spellEnd"/>
-      <w:r>
-        <w:t xml:space="preserve"> provides a clear causal mechanism, so this conclusion is appropriate for R&amp;D review.</w:t>
-      </w:r>
-    </w:p>
-    <w:p>
-      <w:r>
-        <w:t xml:space="preserve">QIAN, </w:t>
-      </w:r>
-      <w:proofErr w:type="spellStart"/>
-      <w:r>
-        <w:t>Yinjue</w:t>
-      </w:r>
-      <w:proofErr w:type="spellEnd"/>
+        <w:t>Strong and evidence-based. The root-cause statement is directly supported by repro_steps (“not resetting properly wizard context…”). Assigned notes mainly provide urgency and symptoms, but the repro_steps provides a clear causal mechanism, so this conclusion is appropriate for R&amp;D review.</w:t>
+      </w:r>
+    </w:p>
+    <w:p>
+      <w:r>
+        <w:t>QIAN, Yinjue</w:t>
+      </w:r>
       <w:r>
         <w:t>:</w:t>
       </w:r>
@@ -344,13 +286,8 @@
           <w:numId w:val="4"/>
         </w:numPr>
       </w:pPr>
-      <w:proofErr w:type="spellStart"/>
-      <w:r>
-        <w:t>CodeChange</w:t>
-      </w:r>
-      <w:proofErr w:type="spellEnd"/>
-      <w:r>
-        <w:t>: True</w:t>
+      <w:r>
+        <w:t>CodeChange: True</w:t>
       </w:r>
     </w:p>
     <w:p>
@@ -374,23 +311,7 @@
       </w:r>
       <w:r>
         <w:br/>
-        <w:t xml:space="preserve">A </w:t>
-      </w:r>
-      <w:proofErr w:type="spellStart"/>
-      <w:r>
-        <w:t>GraphQL</w:t>
-      </w:r>
-      <w:proofErr w:type="spellEnd"/>
-      <w:r>
-        <w:t xml:space="preserve"> query fails on V14.6 EP7 due to blank/orphaned stream names created after adding and removing a predecessor in the flowsheet. The provided </w:t>
-      </w:r>
-      <w:proofErr w:type="spellStart"/>
-      <w:r>
-        <w:t>repro_steps</w:t>
-      </w:r>
-      <w:proofErr w:type="spellEnd"/>
-      <w:r>
-        <w:t xml:space="preserve"> include a detailed query and variables; the failure is attributed to blank streams causing problems in the query execution.</w:t>
+        <w:t>A GraphQL query fails on V14.6 EP7 due to blank/orphaned stream names created after adding and removing a predecessor in the flowsheet. The provided repro_steps include a detailed query and variables; the failure is attributed to blank streams causing problems in the query execution.</w:t>
       </w:r>
     </w:p>
     <w:p>
@@ -463,15 +384,7 @@
         <w:t>Repro-based likely cause:</w:t>
       </w:r>
       <w:r>
-        <w:t xml:space="preserve"> blank/orphaned stream names break </w:t>
-      </w:r>
-      <w:proofErr w:type="spellStart"/>
-      <w:r>
-        <w:t>GraphQL</w:t>
-      </w:r>
-      <w:proofErr w:type="spellEnd"/>
-      <w:r>
-        <w:t xml:space="preserve"> stream handling.</w:t>
+        <w:t xml:space="preserve"> blank/orphaned stream names break GraphQL stream handling.</w:t>
       </w:r>
       <w:r>
         <w:br/>
@@ -556,13 +469,8 @@
           <w:numId w:val="7"/>
         </w:numPr>
       </w:pPr>
-      <w:proofErr w:type="spellStart"/>
-      <w:r>
-        <w:t>CodeChange</w:t>
-      </w:r>
-      <w:proofErr w:type="spellEnd"/>
-      <w:r>
-        <w:t>: False</w:t>
+      <w:r>
+        <w:t>CodeChange: False</w:t>
       </w:r>
     </w:p>
     <w:p>
@@ -586,15 +494,7 @@
       </w:r>
       <w:r>
         <w:br/>
-        <w:t xml:space="preserve">A numerical error is consistently generated when a Boolean </w:t>
-      </w:r>
-      <w:proofErr w:type="spellStart"/>
-      <w:r>
-        <w:t>OnDly</w:t>
-      </w:r>
-      <w:proofErr w:type="spellEnd"/>
-      <w:r>
-        <w:t xml:space="preserve"> is set to True. The error disappears when toggled to False and returns when toggled back to True. The customer reports a significant reduction in RTF when the error occurs.</w:t>
+        <w:t>A numerical error is consistently generated when a Boolean OnDly is set to True. The error disappears when toggled to False and returns when toggled back to True. The customer reports a significant reduction in RTF when the error occurs.</w:t>
       </w:r>
     </w:p>
     <w:p>
@@ -634,28 +534,12 @@
         </w:numPr>
       </w:pPr>
       <w:r>
-        <w:t xml:space="preserve">Pending Verification indicates a fix was applied and verification is </w:t>
-      </w:r>
-      <w:proofErr w:type="gramStart"/>
-      <w:r>
-        <w:t>requested;</w:t>
-      </w:r>
-      <w:proofErr w:type="gramEnd"/>
-      <w:r>
-        <w:t xml:space="preserve"> mention of potential CPU architecture differences.</w:t>
-      </w:r>
-    </w:p>
-    <w:p>
-      <w:r>
-        <w:t xml:space="preserve">Key facts from </w:t>
-      </w:r>
-      <w:proofErr w:type="spellStart"/>
-      <w:r>
-        <w:t>repro_steps</w:t>
-      </w:r>
-      <w:proofErr w:type="spellEnd"/>
-      <w:r>
-        <w:t>:</w:t>
+        <w:t>Pending Verification indicates a fix was applied and verification is requested; mention of potential CPU architecture differences.</w:t>
+      </w:r>
+    </w:p>
+    <w:p>
+      <w:r>
+        <w:t>Key facts from repro_steps:</w:t>
       </w:r>
     </w:p>
     <w:p>
@@ -666,15 +550,7 @@
         </w:numPr>
       </w:pPr>
       <w:r>
-        <w:t xml:space="preserve">Error is tied to Boolean </w:t>
-      </w:r>
-      <w:proofErr w:type="spellStart"/>
-      <w:r>
-        <w:t>OnDly</w:t>
-      </w:r>
-      <w:proofErr w:type="spellEnd"/>
-      <w:r>
-        <w:t xml:space="preserve"> toggling (True triggers, False removes).</w:t>
+        <w:t>Error is tied to Boolean OnDly toggling (True triggers, False removes).</w:t>
       </w:r>
     </w:p>
     <w:p>
@@ -711,23 +587,7 @@
       </w:r>
       <w:r>
         <w:br/>
-        <w:t xml:space="preserve">Acceptable to leave blank. The Assigned evidence does not contain an explicit mechanism; it’s mostly a routing/assignment message. </w:t>
-      </w:r>
-      <w:proofErr w:type="spellStart"/>
-      <w:r>
-        <w:t>Repro_steps</w:t>
-      </w:r>
-      <w:proofErr w:type="spellEnd"/>
-      <w:r>
-        <w:t xml:space="preserve"> describe a strong symptom pattern but do not clearly identify the underlying mechanism (model/case-specific, numerical solver behavior, </w:t>
-      </w:r>
-      <w:proofErr w:type="spellStart"/>
-      <w:r>
-        <w:t>boolean</w:t>
-      </w:r>
-      <w:proofErr w:type="spellEnd"/>
-      <w:r>
-        <w:t xml:space="preserve"> delay implementation, etc.). If you want a safe reviewer-friendly note, keep it conservative:</w:t>
+        <w:t>Acceptable to leave blank. The Assigned evidence does not contain an explicit mechanism; it’s mostly a routing/assignment message. Repro_steps describe a strong symptom pattern but do not clearly identify the underlying mechanism (model/case-specific, numerical solver behavior, boolean delay implementation, etc.). If you want a safe reviewer-friendly note, keep it conservative:</w:t>
       </w:r>
     </w:p>
     <w:p>
@@ -742,23 +602,7 @@
           <w:i/>
           <w:iCs/>
         </w:rPr>
-        <w:t xml:space="preserve">Repro indicates Boolean </w:t>
-      </w:r>
-      <w:proofErr w:type="spellStart"/>
-      <w:r>
-        <w:rPr>
-          <w:i/>
-          <w:iCs/>
-        </w:rPr>
-        <w:t>OnDly</w:t>
-      </w:r>
-      <w:proofErr w:type="spellEnd"/>
-      <w:r>
-        <w:rPr>
-          <w:i/>
-          <w:iCs/>
-        </w:rPr>
-        <w:t xml:space="preserve"> True triggers a consistent numerical error; underlying mechanism not confirmed from Assigned/Investigating evidence.</w:t>
+        <w:t>Repro indicates Boolean OnDly True triggers a consistent numerical error; underlying mechanism not confirmed from Assigned/Investigating evidence.</w:t>
       </w:r>
     </w:p>
     <w:p>
@@ -793,14 +637,7 @@
       </w:r>
       <w:r>
         <w:br/>
-      </w:r>
-      <w:proofErr w:type="spellStart"/>
-      <w:r>
-        <w:t>aspenONE</w:t>
-      </w:r>
-      <w:proofErr w:type="spellEnd"/>
-      <w:r>
-        <w:t xml:space="preserve"> Process Explorer</w:t>
+        <w:t>aspenONE Process Explorer</w:t>
       </w:r>
     </w:p>
     <w:p>
@@ -846,13 +683,8 @@
           <w:numId w:val="12"/>
         </w:numPr>
       </w:pPr>
-      <w:proofErr w:type="spellStart"/>
-      <w:r>
-        <w:t>CodeChange</w:t>
-      </w:r>
-      <w:proofErr w:type="spellEnd"/>
-      <w:r>
-        <w:t>: False</w:t>
+      <w:r>
+        <w:t>CodeChange: False</w:t>
       </w:r>
     </w:p>
     <w:p>
@@ -894,15 +726,7 @@
     </w:p>
     <w:p>
       <w:r>
-        <w:t xml:space="preserve">Key facts from </w:t>
-      </w:r>
-      <w:proofErr w:type="spellStart"/>
-      <w:r>
-        <w:t>repro_steps</w:t>
-      </w:r>
-      <w:proofErr w:type="spellEnd"/>
-      <w:r>
-        <w:t>:</w:t>
+        <w:t>Key facts from repro_steps:</w:t>
       </w:r>
     </w:p>
     <w:p>
@@ -1048,13 +872,8 @@
           <w:numId w:val="15"/>
         </w:numPr>
       </w:pPr>
-      <w:proofErr w:type="spellStart"/>
-      <w:r>
-        <w:t>CodeChange</w:t>
-      </w:r>
-      <w:proofErr w:type="spellEnd"/>
-      <w:r>
-        <w:t>: False</w:t>
+      <w:r>
+        <w:t>CodeChange: False</w:t>
       </w:r>
     </w:p>
     <w:p>
@@ -1079,15 +898,7 @@
       </w:r>
       <w:r>
         <w:br/>
-        <w:t xml:space="preserve">User set an incorrect business plan start date (2026) in a case file. After that, settings within CDM could not be viewed when opening the case file. </w:t>
-      </w:r>
-      <w:proofErr w:type="gramStart"/>
-      <w:r>
-        <w:t>Customer</w:t>
-      </w:r>
-      <w:proofErr w:type="gramEnd"/>
-      <w:r>
-        <w:t xml:space="preserve"> later restored a backup and eventually confirmed the issue was no longer present and the case could be closed.</w:t>
+        <w:t>User set an incorrect business plan start date (2026) in a case file. After that, settings within CDM could not be viewed when opening the case file. Customer later restored a backup and eventually confirmed the issue was no longer present and the case could be closed.</w:t>
       </w:r>
     </w:p>
     <w:p>
@@ -1138,15 +949,7 @@
     </w:p>
     <w:p>
       <w:r>
-        <w:t xml:space="preserve">Key facts from </w:t>
-      </w:r>
-      <w:proofErr w:type="spellStart"/>
-      <w:r>
-        <w:t>repro_steps</w:t>
-      </w:r>
-      <w:proofErr w:type="spellEnd"/>
-      <w:r>
-        <w:t>:</w:t>
+        <w:t>Key facts from repro_steps:</w:t>
       </w:r>
     </w:p>
     <w:p>
@@ -1157,15 +960,7 @@
         </w:numPr>
       </w:pPr>
       <w:r>
-        <w:t>“</w:t>
-      </w:r>
-      <w:proofErr w:type="gramStart"/>
-      <w:r>
-        <w:t>incorrect</w:t>
-      </w:r>
-      <w:proofErr w:type="gramEnd"/>
-      <w:r>
-        <w:t xml:space="preserve"> start date of 2026… now unable to view any settings within CDM.”</w:t>
+        <w:t>“incorrect start date of 2026… now unable to view any settings within CDM.”</w:t>
       </w:r>
     </w:p>
     <w:p>
@@ -1191,15 +986,7 @@
       </w:r>
       <w:r>
         <w:br/>
-        <w:t xml:space="preserve">Good to keep empty. Although </w:t>
-      </w:r>
-      <w:proofErr w:type="spellStart"/>
-      <w:r>
-        <w:t>repro_steps</w:t>
-      </w:r>
-      <w:proofErr w:type="spellEnd"/>
-      <w:r>
-        <w:t xml:space="preserve"> suggest a plausible causal link (invalid date leading to unreadable settings / corrupted state), the Assigned evidence does not confirm a technical mechanism, and the workflow ends with customer restoring backup. For R&amp;D review, safest phrasing is:</w:t>
+        <w:t>Good to keep empty. Although repro_steps suggest a plausible causal link (invalid date leading to unreadable settings / corrupted state), the Assigned evidence does not confirm a technical mechanism, and the workflow ends with customer restoring backup. For R&amp;D review, safest phrasing is:</w:t>
       </w:r>
     </w:p>
     <w:p>
@@ -1300,13 +1087,8 @@
           <w:numId w:val="19"/>
         </w:numPr>
       </w:pPr>
-      <w:proofErr w:type="spellStart"/>
-      <w:r>
-        <w:t>CodeChange</w:t>
-      </w:r>
-      <w:proofErr w:type="spellEnd"/>
-      <w:r>
-        <w:t>: False</w:t>
+      <w:r>
+        <w:t>CodeChange: False</w:t>
       </w:r>
     </w:p>
     <w:p>
@@ -1332,14 +1114,9 @@
         <w:br/>
         <w:t xml:space="preserve">Customer reports recurring “QP internal error” in a DMC3 application. They attempted mitigation by adjusting EPSMVPMX and fixing collinearity; one configuration (EPSMVPMX=5) reduced failures for ~3 weeks but error recurred. Internal attempts could not reproduce in V14.4 VM. Discussion also notes </w:t>
       </w:r>
-      <w:proofErr w:type="spellStart"/>
       <w:r>
         <w:lastRenderedPageBreak/>
-        <w:t>AlgorithmFailureCount</w:t>
-      </w:r>
-      <w:proofErr w:type="spellEnd"/>
-      <w:r>
-        <w:t xml:space="preserve"> being set to 0 and a recommendation to increase it to the default (9). BIN files were discussed but not considered very useful; triage ultimately closed with no further findings.</w:t>
+        <w:t>AlgorithmFailureCount being set to 0 and a recommendation to increase it to the default (9). BIN files were discussed but not considered very useful; triage ultimately closed with no further findings.</w:t>
       </w:r>
     </w:p>
     <w:p>
@@ -1390,15 +1167,7 @@
     </w:p>
     <w:p>
       <w:r>
-        <w:t xml:space="preserve">Key facts from </w:t>
-      </w:r>
-      <w:proofErr w:type="spellStart"/>
-      <w:r>
-        <w:t>repro_steps</w:t>
-      </w:r>
-      <w:proofErr w:type="spellEnd"/>
-      <w:r>
-        <w:t>:</w:t>
+        <w:t>Key facts from repro_steps:</w:t>
       </w:r>
     </w:p>
     <w:p>
@@ -1460,23 +1229,7 @@
           <w:i/>
           <w:iCs/>
         </w:rPr>
-        <w:t xml:space="preserve">Investigating suggests misconfigured </w:t>
-      </w:r>
-      <w:proofErr w:type="spellStart"/>
-      <w:r>
-        <w:rPr>
-          <w:i/>
-          <w:iCs/>
-        </w:rPr>
-        <w:t>AlgorithmFailureCount</w:t>
-      </w:r>
-      <w:proofErr w:type="spellEnd"/>
-      <w:r>
-        <w:rPr>
-          <w:i/>
-          <w:iCs/>
-        </w:rPr>
-        <w:t xml:space="preserve"> (0 vs default 9) may contribute; root cause not confirmed.</w:t>
+        <w:t>Investigating suggests misconfigured AlgorithmFailureCount (0 vs default 9) may contribute; root cause not confirmed.</w:t>
       </w:r>
     </w:p>
     <w:p>
@@ -1557,13 +1310,8 @@
           <w:numId w:val="23"/>
         </w:numPr>
       </w:pPr>
-      <w:proofErr w:type="spellStart"/>
-      <w:r>
-        <w:t>CodeChange</w:t>
-      </w:r>
-      <w:proofErr w:type="spellEnd"/>
-      <w:r>
-        <w:t>: False</w:t>
+      <w:r>
+        <w:t>CodeChange: False</w:t>
       </w:r>
     </w:p>
     <w:p>
@@ -1587,43 +1335,11 @@
       </w:r>
       <w:r>
         <w:br/>
-        <w:t>Customer sees “</w:t>
-      </w:r>
-      <w:proofErr w:type="spellStart"/>
-      <w:r>
-        <w:t>AspenWatch</w:t>
-      </w:r>
-      <w:proofErr w:type="spellEnd"/>
-      <w:r>
-        <w:t xml:space="preserve"> Error 1” when viewing a control objective in PCWS (RTE V14.4 CP1). Initial </w:t>
+        <w:t xml:space="preserve">Customer sees “AspenWatch Error 1” when viewing a control objective in PCWS (RTE V14.4 CP1). Initial </w:t>
       </w:r>
       <w:r>
         <w:lastRenderedPageBreak/>
-        <w:t xml:space="preserve">troubleshooting attempts failed. Diagnostics were requested (set Diagnostic Output Level </w:t>
-      </w:r>
-      <w:proofErr w:type="spellStart"/>
-      <w:r>
-        <w:t>to</w:t>
-      </w:r>
-      <w:proofErr w:type="spellEnd"/>
-      <w:r>
-        <w:t xml:space="preserve"> High to obtain more details). Investigation concluded the issue is caused by missing Aspen Watch history repositories (AW_AGGH and AW_EVTH) due to an out-of-order database upgrade/migration process. Detailed remediation steps were provided (fresh start / recreate shares / rerun IDC / restore snapshots and </w:t>
-      </w:r>
-      <w:proofErr w:type="spellStart"/>
-      <w:r>
-        <w:t>filesets</w:t>
-      </w:r>
-      <w:proofErr w:type="spellEnd"/>
-      <w:r>
-        <w:t xml:space="preserve">). </w:t>
-      </w:r>
-      <w:proofErr w:type="gramStart"/>
-      <w:r>
-        <w:t>Customer</w:t>
-      </w:r>
-      <w:proofErr w:type="gramEnd"/>
-      <w:r>
-        <w:t xml:space="preserve"> later agreed the case could be closed as answered.</w:t>
+        <w:t>troubleshooting attempts failed. Diagnostics were requested (set Diagnostic Output Level to High to obtain more details). Investigation concluded the issue is caused by missing Aspen Watch history repositories (AW_AGGH and AW_EVTH) due to an out-of-order database upgrade/migration process. Detailed remediation steps were provided (fresh start / recreate shares / rerun IDC / restore snapshots and filesets). Customer later agreed the case could be closed as answered.</w:t>
       </w:r>
     </w:p>
     <w:p>
@@ -1669,15 +1385,7 @@
         </w:numPr>
       </w:pPr>
       <w:r>
-        <w:t xml:space="preserve">Detailed recovery steps provided (stop IP.21, replace snapshots, delete shares, rename </w:t>
-      </w:r>
-      <w:proofErr w:type="spellStart"/>
-      <w:r>
-        <w:t>dat</w:t>
-      </w:r>
-      <w:proofErr w:type="spellEnd"/>
-      <w:r>
-        <w:t xml:space="preserve"> files, rerun IDC, etc.).</w:t>
+        <w:t>Detailed recovery steps provided (stop IP.21, replace snapshots, delete shares, rename dat files, rerun IDC, etc.).</w:t>
       </w:r>
     </w:p>
     <w:p>
@@ -1714,26 +1422,13 @@
       </w:r>
       <w:r>
         <w:br/>
-        <w:t xml:space="preserve">Strong and </w:t>
-      </w:r>
-      <w:proofErr w:type="gramStart"/>
-      <w:r>
-        <w:t>reviewer-friendly</w:t>
-      </w:r>
-      <w:proofErr w:type="gramEnd"/>
-      <w:r>
-        <w:t>. The root cause is explicitly stated in Assigned/Investigating notes and is accompanied by a coherent failure mode + remediation steps. This is not an inference; it is a concrete operational root cause tied to upgrade sequencing and missing repository artifacts.</w:t>
-      </w:r>
-    </w:p>
-    <w:p>
-      <w:r>
-        <w:t xml:space="preserve">QIAN, </w:t>
-      </w:r>
-      <w:proofErr w:type="spellStart"/>
-      <w:r>
-        <w:t>Yinjue</w:t>
-      </w:r>
-      <w:proofErr w:type="spellEnd"/>
+        <w:t>Strong and reviewer-friendly. The root cause is explicitly stated in Assigned/Investigating notes and is accompanied by a coherent failure mode + remediation steps. This is not an inference; it is a concrete operational root cause tied to upgrade sequencing and missing repository artifacts.</w:t>
+      </w:r>
+    </w:p>
+    <w:p>
+      <w:r>
+        <w:t>QIAN, Yinjue</w:t>
+      </w:r>
       <w:r>
         <w:t>:</w:t>
       </w:r>
@@ -1826,13 +1521,8 @@
           <w:numId w:val="25"/>
         </w:numPr>
       </w:pPr>
-      <w:proofErr w:type="spellStart"/>
-      <w:r>
-        <w:t>CodeChange</w:t>
-      </w:r>
-      <w:proofErr w:type="spellEnd"/>
-      <w:r>
-        <w:t>: False</w:t>
+      <w:r>
+        <w:t>CodeChange: False</w:t>
       </w:r>
     </w:p>
     <w:p>
@@ -1892,15 +1582,7 @@
         </w:numPr>
       </w:pPr>
       <w:r>
-        <w:t xml:space="preserve">A hypothesis (explicitly labeled as a guess): during new version creation, </w:t>
-      </w:r>
-      <w:proofErr w:type="spellStart"/>
-      <w:r>
-        <w:t>chkDMMasterRecipe.getInstance</w:t>
-      </w:r>
-      <w:proofErr w:type="spellEnd"/>
-      <w:r>
-        <w:t>() is used to set dm; meanwhile reload/state-change may be triggered by other classes that also use the same singleton, leading to timing-dependent mis-association.</w:t>
+        <w:t>A hypothesis (explicitly labeled as a guess): during new version creation, chkDMMasterRecipe.getInstance() is used to set dm; meanwhile reload/state-change may be triggered by other classes that also use the same singleton, leading to timing-dependent mis-association.</w:t>
       </w:r>
     </w:p>
     <w:p>
@@ -1916,15 +1598,7 @@
     </w:p>
     <w:p>
       <w:r>
-        <w:t xml:space="preserve">Key facts from </w:t>
-      </w:r>
-      <w:proofErr w:type="spellStart"/>
-      <w:r>
-        <w:t>repro_steps</w:t>
-      </w:r>
-      <w:proofErr w:type="spellEnd"/>
-      <w:r>
-        <w:t>:</w:t>
+        <w:t>Key facts from repro_steps:</w:t>
       </w:r>
     </w:p>
     <w:p>
@@ -1986,23 +1660,7 @@
           <w:i/>
           <w:iCs/>
         </w:rPr>
-        <w:t>Likely timing/race condition around shared singleton state (</w:t>
-      </w:r>
-      <w:proofErr w:type="spellStart"/>
-      <w:r>
-        <w:rPr>
-          <w:i/>
-          <w:iCs/>
-        </w:rPr>
-        <w:t>chkDMMasterRecipe.getInstance</w:t>
-      </w:r>
-      <w:proofErr w:type="spellEnd"/>
-      <w:r>
-        <w:rPr>
-          <w:i/>
-          <w:iCs/>
-        </w:rPr>
-        <w:t>()) causing the wizard to apply upgrades to the wrong master recipe.</w:t>
+        <w:t>Likely timing/race condition around shared singleton state (chkDMMasterRecipe.getInstance()) causing the wizard to apply upgrades to the wrong master recipe.</w:t>
       </w:r>
       <w:r>
         <w:br/>
@@ -2088,13 +1746,8 @@
           <w:numId w:val="29"/>
         </w:numPr>
       </w:pPr>
-      <w:proofErr w:type="spellStart"/>
-      <w:r>
-        <w:t>CodeChange</w:t>
-      </w:r>
-      <w:proofErr w:type="spellEnd"/>
-      <w:r>
-        <w:t>: False</w:t>
+      <w:r>
+        <w:t>CodeChange: False</w:t>
       </w:r>
     </w:p>
     <w:p>
@@ -2118,33 +1771,7 @@
       </w:r>
       <w:r>
         <w:br/>
-        <w:t xml:space="preserve">Customer experiences Aspen Plus GUI crash when opening/importing a summary (.sum) file, especially when importing into a blank simulation. Investigation indicates the crash is related to a calculator block results/initialization behavior: importing the summary into a blank simulation triggers the crash, while opening the </w:t>
-      </w:r>
-      <w:proofErr w:type="gramStart"/>
-      <w:r>
-        <w:t>corresponding .</w:t>
-      </w:r>
-      <w:proofErr w:type="spellStart"/>
-      <w:r>
-        <w:t>bkp</w:t>
-      </w:r>
-      <w:proofErr w:type="spellEnd"/>
-      <w:proofErr w:type="gramEnd"/>
-      <w:r>
-        <w:t xml:space="preserve"> first and then importing the summary avoids the crash. Workarounds were provided (</w:t>
-      </w:r>
-      <w:proofErr w:type="gramStart"/>
-      <w:r>
-        <w:t>open .</w:t>
-      </w:r>
-      <w:proofErr w:type="spellStart"/>
-      <w:r>
-        <w:t>bkp</w:t>
-      </w:r>
-      <w:proofErr w:type="spellEnd"/>
-      <w:proofErr w:type="gramEnd"/>
-      <w:r>
-        <w:t xml:space="preserve"> first or remove calculator block from summary before import). Customer agreed to close after workaround success.</w:t>
+        <w:t>Customer experiences Aspen Plus GUI crash when opening/importing a summary (.sum) file, especially when importing into a blank simulation. Investigation indicates the crash is related to a calculator block results/initialization behavior: importing the summary into a blank simulation triggers the crash, while opening the corresponding .bkp first and then importing the summary avoids the crash. Workarounds were provided (open .bkp first or remove calculator block from summary before import). Customer agreed to close after workaround success.</w:t>
       </w:r>
     </w:p>
     <w:p>
@@ -2179,28 +1806,7 @@
         </w:numPr>
       </w:pPr>
       <w:r>
-        <w:t xml:space="preserve">Workarounds confirmed: </w:t>
-      </w:r>
-      <w:proofErr w:type="gramStart"/>
-      <w:r>
-        <w:t>open .</w:t>
-      </w:r>
-      <w:proofErr w:type="spellStart"/>
-      <w:r>
-        <w:t>bkp</w:t>
-      </w:r>
-      <w:proofErr w:type="spellEnd"/>
-      <w:proofErr w:type="gramEnd"/>
-      <w:r>
-        <w:t xml:space="preserve"> then </w:t>
-      </w:r>
-      <w:proofErr w:type="gramStart"/>
-      <w:r>
-        <w:t>import .sum</w:t>
-      </w:r>
-      <w:proofErr w:type="gramEnd"/>
-      <w:r>
-        <w:t>; or remove calculator block from summary file before import.</w:t>
+        <w:t>Workarounds confirmed: open .bkp then import .sum; or remove calculator block from summary file before import.</w:t>
       </w:r>
     </w:p>
     <w:p>
@@ -2334,13 +1940,8 @@
           <w:numId w:val="32"/>
         </w:numPr>
       </w:pPr>
-      <w:proofErr w:type="spellStart"/>
-      <w:r>
-        <w:t>CodeChange</w:t>
-      </w:r>
-      <w:proofErr w:type="spellEnd"/>
-      <w:r>
-        <w:t>: False</w:t>
+      <w:r>
+        <w:t>CodeChange: False</w:t>
       </w:r>
     </w:p>
     <w:p>
@@ -2410,28 +2011,12 @@
         </w:numPr>
       </w:pPr>
       <w:r>
-        <w:t xml:space="preserve">Follow-up actions: information shared with </w:t>
-      </w:r>
-      <w:proofErr w:type="gramStart"/>
-      <w:r>
-        <w:t>customer</w:t>
-      </w:r>
-      <w:proofErr w:type="gramEnd"/>
-      <w:r>
-        <w:t>; later no response and case heading toward closure.</w:t>
-      </w:r>
-    </w:p>
-    <w:p>
-      <w:r>
-        <w:t xml:space="preserve">Key facts from </w:t>
-      </w:r>
-      <w:proofErr w:type="spellStart"/>
-      <w:r>
-        <w:t>repro_steps</w:t>
-      </w:r>
-      <w:proofErr w:type="spellEnd"/>
-      <w:r>
-        <w:t>:</w:t>
+        <w:t>Follow-up actions: information shared with customer; later no response and case heading toward closure.</w:t>
+      </w:r>
+    </w:p>
+    <w:p>
+      <w:r>
+        <w:t>Key facts from repro_steps:</w:t>
       </w:r>
     </w:p>
     <w:p>
@@ -2468,15 +2053,7 @@
       </w:r>
       <w:r>
         <w:br/>
-        <w:t xml:space="preserve">Moderately strong. The Investigating notes provide a concrete trigger and a plausible diagnosis tied to customer customization (“customized rules failed to add third </w:t>
-      </w:r>
-      <w:proofErr w:type="spellStart"/>
-      <w:r>
-        <w:t>arg</w:t>
-      </w:r>
-      <w:proofErr w:type="spellEnd"/>
-      <w:r>
-        <w:t xml:space="preserve">”). However, it’s still framed partly as a guess and depends on customer-side configuration. For reviewer clarity, it’s worth noting this is likely </w:t>
+        <w:t xml:space="preserve">Moderately strong. The Investigating notes provide a concrete trigger and a plausible diagnosis tied to customer customization (“customized rules failed to add third arg”). However, it’s still framed partly as a guess and depends on customer-side configuration. For reviewer clarity, it’s worth noting this is likely </w:t>
       </w:r>
       <w:r>
         <w:rPr>
@@ -2486,15 +2063,7 @@
         <w:t>customer customization/misuse</w:t>
       </w:r>
       <w:r>
-        <w:t xml:space="preserve"> rather than a core product defect—unless later evidence shows the core command parser fails to handle missing </w:t>
-      </w:r>
-      <w:proofErr w:type="spellStart"/>
-      <w:r>
-        <w:t>args</w:t>
-      </w:r>
-      <w:proofErr w:type="spellEnd"/>
-      <w:r>
-        <w:t xml:space="preserve"> gracefully. Current wording is acceptable, but you may want to label it as “likely customer customization issue.”</w:t>
+        <w:t xml:space="preserve"> rather than a core product defect—unless later evidence shows the core command parser fails to handle missing args gracefully. Current wording is acceptable, but you may want to label it as “likely customer customization issue.”</w:t>
       </w:r>
     </w:p>
     <w:p>
@@ -2513,21 +2082,7 @@
         <w:rPr>
           <w:highlight w:val="yellow"/>
         </w:rPr>
-        <w:t xml:space="preserve">Sorry for the </w:t>
-      </w:r>
-      <w:proofErr w:type="gramStart"/>
-      <w:r>
-        <w:rPr>
-          <w:highlight w:val="yellow"/>
-        </w:rPr>
-        <w:t>delay</w:t>
-      </w:r>
-      <w:proofErr w:type="gramEnd"/>
-      <w:r>
-        <w:rPr>
-          <w:highlight w:val="yellow"/>
-        </w:rPr>
-        <w:t xml:space="preserve"> reply as I am on vacation these days. I think the summary is correct for this defect. Good job.</w:t>
+        <w:t>Sorry for the delay reply as I am on vacation these days. I think the summary is correct for this defect. Good job.</w:t>
       </w:r>
     </w:p>
     <w:p>
@@ -2615,13 +2170,8 @@
           <w:numId w:val="35"/>
         </w:numPr>
       </w:pPr>
-      <w:proofErr w:type="spellStart"/>
-      <w:r>
-        <w:t>CodeChange</w:t>
-      </w:r>
-      <w:proofErr w:type="spellEnd"/>
-      <w:r>
-        <w:t>: False</w:t>
+      <w:r>
+        <w:t>CodeChange: False</w:t>
       </w:r>
     </w:p>
     <w:p>
@@ -2645,23 +2195,7 @@
       </w:r>
       <w:r>
         <w:br/>
-        <w:t xml:space="preserve">Customer sees run-time error -2146234304 (80131040) when launching PID Watch (and similarly IQ Config) on a Windows 11 Pro laptop. The environment appears to have mixed-version components (mentions SLM v15 installed on the same machine), and prior similar cases were resolved by restoring/repairing HTML Help / ActiveX dependencies. A specific workaround points to missing/unregistered Aspen </w:t>
-      </w:r>
-      <w:proofErr w:type="spellStart"/>
-      <w:r>
-        <w:t>HtmlHelp</w:t>
-      </w:r>
-      <w:proofErr w:type="spellEnd"/>
-      <w:r>
-        <w:t xml:space="preserve"> V14.0 folder/files and registering AspenTech.HtmlHelp.HelpLauncher.dll via </w:t>
-      </w:r>
-      <w:proofErr w:type="spellStart"/>
-      <w:r>
-        <w:t>RegAsm</w:t>
-      </w:r>
-      <w:proofErr w:type="spellEnd"/>
-      <w:r>
-        <w:t>. Customer later resolved by rebuilding from a working VM baseline and reinstalling required components; triage closed.</w:t>
+        <w:t>Customer sees run-time error -2146234304 (80131040) when launching PID Watch (and similarly IQ Config) on a Windows 11 Pro laptop. The environment appears to have mixed-version components (mentions SLM v15 installed on the same machine), and prior similar cases were resolved by restoring/repairing HTML Help / ActiveX dependencies. A specific workaround points to missing/unregistered Aspen HtmlHelp V14.0 folder/files and registering AspenTech.HtmlHelp.HelpLauncher.dll via RegAsm. Customer later resolved by rebuilding from a working VM baseline and reinstalling required components; triage closed.</w:t>
       </w:r>
     </w:p>
     <w:p>
@@ -2696,23 +2230,7 @@
         </w:numPr>
       </w:pPr>
       <w:r>
-        <w:t xml:space="preserve">Specific diagnosis: SLM components V15 installed → V14 HTML Help folder/files missing or not registered; </w:t>
-      </w:r>
-      <w:proofErr w:type="gramStart"/>
-      <w:r>
-        <w:t>requires</w:t>
-      </w:r>
-      <w:proofErr w:type="gramEnd"/>
-      <w:r>
-        <w:t xml:space="preserve"> copying Aspen </w:t>
-      </w:r>
-      <w:proofErr w:type="spellStart"/>
-      <w:r>
-        <w:t>HtmlHelp</w:t>
-      </w:r>
-      <w:proofErr w:type="spellEnd"/>
-      <w:r>
-        <w:t xml:space="preserve"> V14.0 folder and registering DLL type library.</w:t>
+        <w:t>Specific diagnosis: SLM components V15 installed → V14 HTML Help folder/files missing or not registered; requires copying Aspen HtmlHelp V14.0 folder and registering DLL type library.</w:t>
       </w:r>
     </w:p>
     <w:p>
@@ -2734,23 +2252,7 @@
         </w:numPr>
       </w:pPr>
       <w:r>
-        <w:t xml:space="preserve">Resolution: customer solved by duplicating a </w:t>
-      </w:r>
-      <w:proofErr w:type="gramStart"/>
-      <w:r>
-        <w:t>known</w:t>
-      </w:r>
-      <w:proofErr w:type="gramEnd"/>
-      <w:r>
-        <w:t>-</w:t>
-      </w:r>
-      <w:proofErr w:type="gramStart"/>
-      <w:r>
-        <w:t>good</w:t>
-      </w:r>
-      <w:proofErr w:type="gramEnd"/>
-      <w:r>
-        <w:t xml:space="preserve"> VM, changing hostname, installing SLM v14.5 + Aspen Online + dongle/license, verifying PID Watch &amp; IQ Config work; then planned uninstall steps; triage closed.</w:t>
+        <w:t>Resolution: customer solved by duplicating a known-good VM, changing hostname, installing SLM v14.5 + Aspen Online + dongle/license, verifying PID Watch &amp; IQ Config work; then planned uninstall steps; triage closed.</w:t>
       </w:r>
     </w:p>
     <w:p>
@@ -2763,15 +2265,7 @@
       </w:r>
       <w:r>
         <w:br/>
-        <w:t xml:space="preserve">Missing or unregistered Aspen </w:t>
-      </w:r>
-      <w:proofErr w:type="spellStart"/>
-      <w:r>
-        <w:t>HtmlHelp</w:t>
-      </w:r>
-      <w:proofErr w:type="spellEnd"/>
-      <w:r>
-        <w:t xml:space="preserve"> V14.0 files</w:t>
+        <w:t>Missing or unregistered Aspen HtmlHelp V14.0 files</w:t>
       </w:r>
     </w:p>
     <w:p>
@@ -2789,13 +2283,8 @@
     </w:p>
     <w:p>
       <w:r>
-        <w:t xml:space="preserve">QIAN, </w:t>
-      </w:r>
-      <w:proofErr w:type="spellStart"/>
-      <w:r>
-        <w:t>Yinjue</w:t>
-      </w:r>
-      <w:proofErr w:type="spellEnd"/>
+        <w:t>QIAN, Yinjue</w:t>
+      </w:r>
       <w:r>
         <w:t>:</w:t>
       </w:r>
@@ -2889,13 +2378,8 @@
           <w:numId w:val="37"/>
         </w:numPr>
       </w:pPr>
-      <w:proofErr w:type="spellStart"/>
-      <w:r>
-        <w:t>CodeChange</w:t>
-      </w:r>
-      <w:proofErr w:type="spellEnd"/>
-      <w:r>
-        <w:t>: False</w:t>
+      <w:r>
+        <w:t>CodeChange: False</w:t>
       </w:r>
     </w:p>
     <w:p>
@@ -2919,15 +2403,7 @@
       </w:r>
       <w:r>
         <w:br/>
-        <w:t xml:space="preserve">During a roll-forward procedure for an Aspen Supply Chain Management PS model, customer hit an unusual error involving usync.exe, described as linking to “Just-in-time associated with Visual Studio.” Internal note indicates this executable is not from </w:t>
-      </w:r>
-      <w:proofErr w:type="spellStart"/>
-      <w:r>
-        <w:t>AspenTech</w:t>
-      </w:r>
-      <w:proofErr w:type="spellEnd"/>
-      <w:r>
-        <w:t xml:space="preserve"> and may be a customer utility; issue was resolved after a server reboot and case could be closed.</w:t>
+        <w:t>During a roll-forward procedure for an Aspen Supply Chain Management PS model, customer hit an unusual error involving usync.exe, described as linking to “Just-in-time associated with Visual Studio.” Internal note indicates this executable is not from AspenTech and may be a customer utility; issue was resolved after a server reboot and case could be closed.</w:t>
       </w:r>
     </w:p>
     <w:p>
@@ -2955,23 +2431,7 @@
         </w:numPr>
       </w:pPr>
       <w:r>
-        <w:t xml:space="preserve">usync.exe is not an </w:t>
-      </w:r>
-      <w:proofErr w:type="spellStart"/>
-      <w:r>
-        <w:t>AspenTech</w:t>
-      </w:r>
-      <w:proofErr w:type="spellEnd"/>
-      <w:r>
-        <w:t xml:space="preserve"> program; </w:t>
-      </w:r>
-      <w:proofErr w:type="gramStart"/>
-      <w:r>
-        <w:t>might</w:t>
-      </w:r>
-      <w:proofErr w:type="gramEnd"/>
-      <w:r>
-        <w:t xml:space="preserve"> be customer-side utility.</w:t>
+        <w:t>usync.exe is not an AspenTech program; might be customer-side utility.</w:t>
       </w:r>
     </w:p>
     <w:p>
@@ -3008,15 +2468,7 @@
       </w:r>
       <w:r>
         <w:br/>
-        <w:t xml:space="preserve">Correct to keep root cause empty (or at most “unknown / likely external”). Evidence indicates it’s not an </w:t>
-      </w:r>
-      <w:proofErr w:type="spellStart"/>
-      <w:r>
-        <w:t>AspenTech</w:t>
-      </w:r>
-      <w:proofErr w:type="spellEnd"/>
-      <w:r>
-        <w:t xml:space="preserve"> component and was resolved by reboot, which is not sufficient to attribute a product defect root cause. Reviewer-friendly phrasing if needed:</w:t>
+        <w:t>Correct to keep root cause empty (or at most “unknown / likely external”). Evidence indicates it’s not an AspenTech component and was resolved by reboot, which is not sufficient to attribute a product defect root cause. Reviewer-friendly phrasing if needed:</w:t>
       </w:r>
     </w:p>
     <w:p>
@@ -3113,13 +2565,8 @@
           <w:numId w:val="40"/>
         </w:numPr>
       </w:pPr>
-      <w:proofErr w:type="spellStart"/>
-      <w:r>
-        <w:t>CodeChange</w:t>
-      </w:r>
-      <w:proofErr w:type="spellEnd"/>
-      <w:r>
-        <w:t>: False</w:t>
+      <w:r>
+        <w:t>CodeChange: False</w:t>
       </w:r>
     </w:p>
     <w:p>
@@ -3143,31 +2590,7 @@
       </w:r>
       <w:r>
         <w:br/>
-        <w:t xml:space="preserve">DMC3Builder intermittently crashes during deployment and may lose changes made during collinearity repair. Video evidence suggests Builder is slow and application may be large. Internal suspicion is high memory consumption in a 32-bit application (V14) leading to intermittent crash. Support requested the DMC3 project, event viewer logs, and specific RTE cloud </w:t>
-      </w:r>
-      <w:proofErr w:type="gramStart"/>
-      <w:r>
-        <w:t>logs (.</w:t>
-      </w:r>
-      <w:proofErr w:type="gramEnd"/>
-      <w:r>
-        <w:t>BIN</w:t>
-      </w:r>
-      <w:proofErr w:type="gramStart"/>
-      <w:r>
-        <w:t>/.PRT/.PRB</w:t>
-      </w:r>
-      <w:proofErr w:type="gramEnd"/>
-      <w:r>
-        <w:t xml:space="preserve">) for further investigation. </w:t>
-      </w:r>
-      <w:proofErr w:type="gramStart"/>
-      <w:r>
-        <w:t>Customer</w:t>
-      </w:r>
-      <w:proofErr w:type="gramEnd"/>
-      <w:r>
-        <w:t xml:space="preserve"> later couldn’t reproduce and had restored changes, requested closure; defect closed.</w:t>
+        <w:t>DMC3Builder intermittently crashes during deployment and may lose changes made during collinearity repair. Video evidence suggests Builder is slow and application may be large. Internal suspicion is high memory consumption in a 32-bit application (V14) leading to intermittent crash. Support requested the DMC3 project, event viewer logs, and specific RTE cloud logs (.BIN/.PRT/.PRB) for further investigation. Customer later couldn’t reproduce and had restored changes, requested closure; defect closed.</w:t>
       </w:r>
     </w:p>
     <w:p>
@@ -3335,13 +2758,8 @@
           <w:numId w:val="43"/>
         </w:numPr>
       </w:pPr>
-      <w:proofErr w:type="spellStart"/>
-      <w:r>
-        <w:t>CodeChange</w:t>
-      </w:r>
-      <w:proofErr w:type="spellEnd"/>
-      <w:r>
-        <w:t>: False</w:t>
+      <w:r>
+        <w:t>CodeChange: False</w:t>
       </w:r>
     </w:p>
     <w:p>
@@ -3424,15 +2842,7 @@
       </w:r>
       <w:r>
         <w:br/>
-        <w:t xml:space="preserve">(LLM call failed with 429; current </w:t>
-      </w:r>
-      <w:proofErr w:type="spellStart"/>
-      <w:r>
-        <w:t>root_cause</w:t>
-      </w:r>
-      <w:proofErr w:type="spellEnd"/>
-      <w:r>
-        <w:t xml:space="preserve"> is null)</w:t>
+        <w:t>(LLM call failed with 429; current root_cause is null)</w:t>
       </w:r>
     </w:p>
     <w:p>
@@ -3541,13 +2951,8 @@
           <w:numId w:val="46"/>
         </w:numPr>
       </w:pPr>
-      <w:proofErr w:type="spellStart"/>
-      <w:r>
-        <w:t>CodeChange</w:t>
-      </w:r>
-      <w:proofErr w:type="spellEnd"/>
-      <w:r>
-        <w:t>: False</w:t>
+      <w:r>
+        <w:t>CodeChange: False</w:t>
       </w:r>
     </w:p>
     <w:p>
@@ -3646,15 +3051,7 @@
       </w:r>
       <w:r>
         <w:br/>
-        <w:t xml:space="preserve">(LLM call failed with 429; current </w:t>
-      </w:r>
-      <w:proofErr w:type="spellStart"/>
-      <w:r>
-        <w:t>root_cause</w:t>
-      </w:r>
-      <w:proofErr w:type="spellEnd"/>
-      <w:r>
-        <w:t xml:space="preserve"> is null)</w:t>
+        <w:t>(LLM call failed with 429; current root_cause is null)</w:t>
       </w:r>
     </w:p>
     <w:p>
@@ -3667,15 +3064,7 @@
       </w:r>
       <w:r>
         <w:br/>
-        <w:t xml:space="preserve">Appropriately leave root cause empty / unknown. The thread clearly indicates an active investigation with incomplete reproducibility and shifting evidence due to model changes. The best </w:t>
-      </w:r>
-      <w:proofErr w:type="gramStart"/>
-      <w:r>
-        <w:t>reviewer</w:t>
-      </w:r>
-      <w:proofErr w:type="gramEnd"/>
-      <w:r>
-        <w:t xml:space="preserve"> framing is:</w:t>
+        <w:t>Appropriately leave root cause empty / unknown. The thread clearly indicates an active investigation with incomplete reproducibility and shifting evidence due to model changes. The best reviewer framing is:</w:t>
       </w:r>
     </w:p>
     <w:p>
@@ -3775,13 +3164,8 @@
           <w:numId w:val="50"/>
         </w:numPr>
       </w:pPr>
-      <w:proofErr w:type="spellStart"/>
-      <w:r>
-        <w:t>CodeChange</w:t>
-      </w:r>
-      <w:proofErr w:type="spellEnd"/>
-      <w:r>
-        <w:t>: False</w:t>
+      <w:r>
+        <w:t>CodeChange: False</w:t>
       </w:r>
     </w:p>
     <w:p>
@@ -3812,23 +3196,7 @@
     </w:p>
     <w:p>
       <w:r>
-        <w:t xml:space="preserve">Over the past 5 weeks, intermittent communication problems were observed between APC servers and GDOT via </w:t>
-      </w:r>
-      <w:proofErr w:type="spellStart"/>
-      <w:r>
-        <w:t>APCGateway</w:t>
-      </w:r>
-      <w:proofErr w:type="spellEnd"/>
-      <w:r>
-        <w:t xml:space="preserve">. When too many execution cycles were skipped due to bad values, the GDOT optimizer turned OFF automatically. Logs show repeated disconnections and reconnections between APC RTE Data Services and GDOT’s </w:t>
-      </w:r>
-      <w:proofErr w:type="spellStart"/>
-      <w:r>
-        <w:t>APCGateway</w:t>
-      </w:r>
-      <w:proofErr w:type="spellEnd"/>
-      <w:r>
-        <w:t>. The optimizer required manual restart.</w:t>
+        <w:t>Over the past 5 weeks, intermittent communication problems were observed between APC servers and GDOT via APCGateway. When too many execution cycles were skipped due to bad values, the GDOT optimizer turned OFF automatically. Logs show repeated disconnections and reconnections between APC RTE Data Services and GDOT’s APCGateway. The optimizer required manual restart.</w:t>
       </w:r>
     </w:p>
     <w:p>
@@ -3858,13 +3226,8 @@
           <w:numId w:val="51"/>
         </w:numPr>
       </w:pPr>
-      <w:proofErr w:type="spellStart"/>
-      <w:r>
-        <w:t>APCGateway</w:t>
-      </w:r>
-      <w:proofErr w:type="spellEnd"/>
-      <w:r>
-        <w:t xml:space="preserve"> logs show clear host disconnection and reconnection events (e.g., 23:00–23:50 on Sept 11).</w:t>
+      <w:r>
+        <w:t>APCGateway logs show clear host disconnection and reconnection events (e.g., 23:00–23:50 on Sept 11).</w:t>
       </w:r>
     </w:p>
     <w:p>
@@ -3969,15 +3332,7 @@
     </w:p>
     <w:p>
       <w:r>
-        <w:t xml:space="preserve">Very strong and </w:t>
-      </w:r>
-      <w:proofErr w:type="gramStart"/>
-      <w:r>
-        <w:t>evidence-based</w:t>
-      </w:r>
-      <w:proofErr w:type="gramEnd"/>
-      <w:r>
-        <w:t>.</w:t>
+        <w:t>Very strong and evidence-based.</w:t>
       </w:r>
     </w:p>
     <w:p>
@@ -4007,21 +3362,7 @@
         <w:rPr>
           <w:highlight w:val="yellow"/>
         </w:rPr>
-        <w:t xml:space="preserve">Conclusion that this is not a GDOT defect is well supported." </w:t>
-      </w:r>
-      <w:proofErr w:type="gramStart"/>
-      <w:r>
-        <w:rPr>
-          <w:highlight w:val="yellow"/>
-        </w:rPr>
-        <w:t>this</w:t>
-      </w:r>
-      <w:proofErr w:type="gramEnd"/>
-      <w:r>
-        <w:rPr>
-          <w:highlight w:val="yellow"/>
-        </w:rPr>
-        <w:t xml:space="preserve"> sentence seems to have a grammar error</w:t>
+        <w:t>Conclusion that this is not a GDOT defect is well supported." this sentence seems to have a grammar error</w:t>
       </w:r>
     </w:p>
     <w:p>
@@ -4102,13 +3443,8 @@
           <w:numId w:val="52"/>
         </w:numPr>
       </w:pPr>
-      <w:proofErr w:type="spellStart"/>
-      <w:r>
-        <w:t>CodeChange</w:t>
-      </w:r>
-      <w:proofErr w:type="spellEnd"/>
-      <w:r>
-        <w:t>: False</w:t>
+      <w:r>
+        <w:t>CodeChange: False</w:t>
       </w:r>
     </w:p>
     <w:p>
@@ -4139,15 +3475,7 @@
     </w:p>
     <w:p>
       <w:r>
-        <w:t xml:space="preserve">GDOT optimizer turns OFF after 30–60 minutes due to “OUT OF MEMORY” error. Event Viewer shows .NET Runtime error involving GDOTdatabaseintegration.exe. Server memory usage overall is moderate (37%, 265GB/300GB). Customer noticed </w:t>
-      </w:r>
-      <w:proofErr w:type="spellStart"/>
-      <w:r>
-        <w:t>AUInput</w:t>
-      </w:r>
-      <w:proofErr w:type="spellEnd"/>
-      <w:r>
-        <w:t xml:space="preserve"> SQL database size is ~72GB and questioned whether database size could be related.</w:t>
+        <w:t>GDOT optimizer turns OFF after 30–60 minutes due to “OUT OF MEMORY” error. Event Viewer shows .NET Runtime error involving GDOTdatabaseintegration.exe. Server memory usage overall is moderate (37%, 265GB/300GB). Customer noticed AUInput SQL database size is ~72GB and questioned whether database size could be related.</w:t>
       </w:r>
     </w:p>
     <w:p>
@@ -4189,15 +3517,7 @@
         </w:numPr>
       </w:pPr>
       <w:r>
-        <w:t xml:space="preserve">Suggested approach: delete unused models from Unified and purge via </w:t>
-      </w:r>
-      <w:proofErr w:type="spellStart"/>
-      <w:r>
-        <w:t>PSCAdmin</w:t>
-      </w:r>
-      <w:proofErr w:type="spellEnd"/>
-      <w:r>
-        <w:t xml:space="preserve"> utility.</w:t>
+        <w:t>Suggested approach: delete unused models from Unified and purge via PSCAdmin utility.</w:t>
       </w:r>
     </w:p>
     <w:p>
@@ -4270,15 +3590,7 @@
     </w:p>
     <w:p>
       <w:r>
-        <w:t xml:space="preserve">While the database size was highlighted and purge recommended, no direct evidence conclusively ties the 72GB size to the memory crash. However, use of </w:t>
-      </w:r>
-      <w:proofErr w:type="spellStart"/>
-      <w:r>
-        <w:t>PSCAdmin</w:t>
-      </w:r>
-      <w:proofErr w:type="spellEnd"/>
-      <w:r>
-        <w:t xml:space="preserve"> purge and upgrade recommendation suggests environmental/system-level mitigation rather than core product defect.</w:t>
+        <w:t>While the database size was highlighted and purge recommended, no direct evidence conclusively ties the 72GB size to the memory crash. However, use of PSCAdmin purge and upgrade recommendation suggests environmental/system-level mitigation rather than core product defect.</w:t>
       </w:r>
     </w:p>
     <w:p>
@@ -4310,49 +3622,7 @@
         <w:rPr>
           <w:highlight w:val="yellow"/>
         </w:rPr>
-        <w:t xml:space="preserve">No, this is not correct interpretation of the root cause. </w:t>
-      </w:r>
-      <w:proofErr w:type="gramStart"/>
-      <w:r>
-        <w:rPr>
-          <w:highlight w:val="yellow"/>
-        </w:rPr>
-        <w:t>Unfortunately</w:t>
-      </w:r>
-      <w:proofErr w:type="gramEnd"/>
-      <w:r>
-        <w:rPr>
-          <w:highlight w:val="yellow"/>
-        </w:rPr>
-        <w:t xml:space="preserve"> two issues from completely different products were discussed in this defect so I don’t think this is </w:t>
-      </w:r>
-      <w:proofErr w:type="gramStart"/>
-      <w:r>
-        <w:rPr>
-          <w:highlight w:val="yellow"/>
-        </w:rPr>
-        <w:t>a right</w:t>
-      </w:r>
-      <w:proofErr w:type="gramEnd"/>
-      <w:r>
-        <w:rPr>
-          <w:highlight w:val="yellow"/>
-        </w:rPr>
-        <w:t xml:space="preserve"> defect to analyze. More than that it just summarized the topics under </w:t>
-      </w:r>
-      <w:proofErr w:type="gramStart"/>
-      <w:r>
-        <w:rPr>
-          <w:highlight w:val="yellow"/>
-        </w:rPr>
-        <w:t>discussion section</w:t>
-      </w:r>
-      <w:proofErr w:type="gramEnd"/>
-      <w:r>
-        <w:rPr>
-          <w:highlight w:val="yellow"/>
-        </w:rPr>
-        <w:t xml:space="preserve"> without giving any useful additional information.</w:t>
+        <w:t>No, this is not correct interpretation of the root cause. Unfortunately two issues from completely different products were discussed in this defect so I don’t think this is a right defect to analyze. More than that it just summarized the topics under discussion section without giving any useful additional information.</w:t>
       </w:r>
     </w:p>
     <w:p>
@@ -4433,13 +3703,8 @@
           <w:numId w:val="55"/>
         </w:numPr>
       </w:pPr>
-      <w:proofErr w:type="spellStart"/>
-      <w:r>
-        <w:t>CodeChange</w:t>
-      </w:r>
-      <w:proofErr w:type="spellEnd"/>
-      <w:r>
-        <w:t>: False</w:t>
+      <w:r>
+        <w:t>CodeChange: False</w:t>
       </w:r>
     </w:p>
     <w:p>
@@ -4470,28 +3735,12 @@
     </w:p>
     <w:p>
       <w:r>
-        <w:t xml:space="preserve">Orphan and duplicate entities observed when users perform “in-parallel model building.” Similar behavior reproduced in V15.0 CP2 and </w:t>
-      </w:r>
-      <w:proofErr w:type="gramStart"/>
-      <w:r>
-        <w:t>still</w:t>
-      </w:r>
-      <w:proofErr w:type="gramEnd"/>
-      <w:r>
-        <w:t xml:space="preserve"> possible in V15.1.</w:t>
-      </w:r>
-    </w:p>
-    <w:p>
-      <w:r>
-        <w:t xml:space="preserve">No errors during check-in or get-latest operations, but duplicate names appear in validation </w:t>
-      </w:r>
-      <w:proofErr w:type="gramStart"/>
-      <w:r>
-        <w:t>report</w:t>
-      </w:r>
-      <w:proofErr w:type="gramEnd"/>
-      <w:r>
-        <w:t>.</w:t>
+        <w:t>Orphan and duplicate entities observed when users perform “in-parallel model building.” Similar behavior reproduced in V15.0 CP2 and still possible in V15.1.</w:t>
+      </w:r>
+    </w:p>
+    <w:p>
+      <w:r>
+        <w:t>No errors during check-in or get-latest operations, but duplicate names appear in validation report.</w:t>
       </w:r>
     </w:p>
     <w:p>
@@ -4601,15 +3850,7 @@
     </w:p>
     <w:p>
       <w:r>
-        <w:t>Evidence-</w:t>
-      </w:r>
-      <w:proofErr w:type="gramStart"/>
-      <w:r>
-        <w:t>based but</w:t>
-      </w:r>
-      <w:proofErr w:type="gramEnd"/>
-      <w:r>
-        <w:t xml:space="preserve"> behavior may be by design.</w:t>
+        <w:t>Evidence-based but behavior may be by design.</w:t>
       </w:r>
     </w:p>
     <w:p>
@@ -4665,21 +3906,7 @@
         <w:rPr>
           <w:highlight w:val="yellow"/>
         </w:rPr>
-        <w:t xml:space="preserve"> was working by design, I don't remember why we didn't just close it. I think we just wanted QE to do some testing in that area to make sure nothing unexpected was </w:t>
-      </w:r>
-      <w:proofErr w:type="gramStart"/>
-      <w:r>
-        <w:rPr>
-          <w:highlight w:val="yellow"/>
-        </w:rPr>
-        <w:t>actually happening</w:t>
-      </w:r>
-      <w:proofErr w:type="gramEnd"/>
-      <w:r>
-        <w:rPr>
-          <w:highlight w:val="yellow"/>
-        </w:rPr>
-        <w:t>. The LLM generated root cause is OK I think, it says behavior may be by design, which is true.</w:t>
+        <w:t xml:space="preserve"> was working by design, I don't remember why we didn't just close it. I think we just wanted QE to do some testing in that area to make sure nothing unexpected was actually happening. The LLM generated root cause is OK I think, it says behavior may be by design, which is true.</w:t>
       </w:r>
       <w:r>
         <w:t> </w:t>
@@ -4763,13 +3990,8 @@
           <w:numId w:val="58"/>
         </w:numPr>
       </w:pPr>
-      <w:proofErr w:type="spellStart"/>
-      <w:r>
-        <w:t>CodeChange</w:t>
-      </w:r>
-      <w:proofErr w:type="spellEnd"/>
-      <w:r>
-        <w:t>: False</w:t>
+      <w:r>
+        <w:t>CodeChange: False</w:t>
       </w:r>
     </w:p>
     <w:p>
@@ -4800,31 +4022,7 @@
     </w:p>
     <w:p>
       <w:r>
-        <w:t xml:space="preserve">HYSYS V15 freezes when adding external streams within a </w:t>
-      </w:r>
-      <w:proofErr w:type="spellStart"/>
-      <w:r>
-        <w:t>Selexol</w:t>
-      </w:r>
-      <w:proofErr w:type="spellEnd"/>
-      <w:r>
-        <w:t xml:space="preserve"> </w:t>
-      </w:r>
-      <w:proofErr w:type="spellStart"/>
-      <w:r>
-        <w:t>subflowsheet</w:t>
-      </w:r>
-      <w:proofErr w:type="spellEnd"/>
-      <w:r>
-        <w:t xml:space="preserve"> connection. Solver remains in “</w:t>
-      </w:r>
-      <w:proofErr w:type="spellStart"/>
-      <w:r>
-        <w:t>Main_Solver_Active</w:t>
-      </w:r>
-      <w:proofErr w:type="spellEnd"/>
-      <w:r>
-        <w:t>” state. In some cases, main flowsheet disappears after switching tabs. Issue reproducible in V15.0 but not in V15.2.</w:t>
+        <w:t>HYSYS V15 freezes when adding external streams within a Selexol subflowsheet connection. Solver remains in “Main_Solver_Active” state. In some cases, main flowsheet disappears after switching tabs. Issue reproducible in V15.0 but not in V15.2.</w:t>
       </w:r>
     </w:p>
     <w:p>
@@ -4878,23 +4076,7 @@
         </w:numPr>
       </w:pPr>
       <w:r>
-        <w:t xml:space="preserve">Root cause traced to SET operations located inside </w:t>
-      </w:r>
-      <w:proofErr w:type="spellStart"/>
-      <w:r>
-        <w:t>Selexol</w:t>
-      </w:r>
-      <w:proofErr w:type="spellEnd"/>
-      <w:r>
-        <w:t xml:space="preserve"> </w:t>
-      </w:r>
-      <w:proofErr w:type="spellStart"/>
-      <w:r>
-        <w:t>subflowsheet</w:t>
-      </w:r>
-      <w:proofErr w:type="spellEnd"/>
-      <w:r>
-        <w:t>.</w:t>
+        <w:t>Root cause traced to SET operations located inside Selexol subflowsheet.</w:t>
       </w:r>
     </w:p>
     <w:p>
@@ -4947,15 +4129,7 @@
     </w:p>
     <w:p>
       <w:r>
-        <w:t xml:space="preserve">SET operations inside </w:t>
-      </w:r>
-      <w:proofErr w:type="spellStart"/>
-      <w:r>
-        <w:t>subflowsheet</w:t>
-      </w:r>
-      <w:proofErr w:type="spellEnd"/>
-      <w:r>
-        <w:t xml:space="preserve"> causing solver state deadlock in V15.0</w:t>
+        <w:t>SET operations inside subflowsheet causing solver state deadlock in V15.0</w:t>
       </w:r>
     </w:p>
     <w:p>
@@ -5006,21 +4180,7 @@
         <w:rPr>
           <w:highlight w:val="yellow"/>
         </w:rPr>
-        <w:t xml:space="preserve">The issue was with the connections rather than with the unit operation of the SET. They worked at first, but the case became corrupted for some reason we don’t know, so we couldn’t generalize that SET only works outside of </w:t>
-      </w:r>
-      <w:proofErr w:type="spellStart"/>
-      <w:r>
-        <w:rPr>
-          <w:highlight w:val="yellow"/>
-        </w:rPr>
-        <w:t>subflowsheets</w:t>
-      </w:r>
-      <w:proofErr w:type="spellEnd"/>
-      <w:r>
-        <w:rPr>
-          <w:highlight w:val="yellow"/>
-        </w:rPr>
-        <w:t>.</w:t>
+        <w:t>The issue was with the connections rather than with the unit operation of the SET. They worked at first, but the case became corrupted for some reason we don’t know, so we couldn’t generalize that SET only works outside of subflowsheets.</w:t>
       </w:r>
     </w:p>
     <w:p>
@@ -5101,13 +4261,8 @@
           <w:numId w:val="60"/>
         </w:numPr>
       </w:pPr>
-      <w:proofErr w:type="spellStart"/>
-      <w:r>
-        <w:t>CodeChange</w:t>
-      </w:r>
-      <w:proofErr w:type="spellEnd"/>
-      <w:r>
-        <w:t>: True</w:t>
+      <w:r>
+        <w:t>CodeChange: True</w:t>
       </w:r>
     </w:p>
     <w:p>
@@ -5254,15 +4409,7 @@
     </w:p>
     <w:p>
       <w:r>
-        <w:t xml:space="preserve">Clear regression </w:t>
-      </w:r>
-      <w:proofErr w:type="gramStart"/>
-      <w:r>
-        <w:t>defect</w:t>
-      </w:r>
-      <w:proofErr w:type="gramEnd"/>
-      <w:r>
-        <w:t xml:space="preserve"> with code fix.</w:t>
+        <w:t>Clear regression defect with code fix.</w:t>
       </w:r>
     </w:p>
     <w:p>
@@ -5272,13 +4419,8 @@
     </w:p>
     <w:p>
       <w:r>
-        <w:t xml:space="preserve">QIAN, </w:t>
-      </w:r>
-      <w:proofErr w:type="spellStart"/>
-      <w:r>
-        <w:t>Yinjue</w:t>
-      </w:r>
-      <w:proofErr w:type="spellEnd"/>
+        <w:t>QIAN, Yinjue</w:t>
+      </w:r>
       <w:r>
         <w:t>:</w:t>
       </w:r>
@@ -5372,13 +4514,8 @@
           <w:numId w:val="62"/>
         </w:numPr>
       </w:pPr>
-      <w:proofErr w:type="spellStart"/>
-      <w:r>
-        <w:t>CodeChange</w:t>
-      </w:r>
-      <w:proofErr w:type="spellEnd"/>
-      <w:r>
-        <w:t>: False</w:t>
+      <w:r>
+        <w:t>CodeChange: False</w:t>
       </w:r>
     </w:p>
     <w:p>
@@ -5451,13 +4588,8 @@
           <w:numId w:val="63"/>
         </w:numPr>
       </w:pPr>
-      <w:proofErr w:type="spellStart"/>
-      <w:r>
-        <w:t>ECharts</w:t>
-      </w:r>
-      <w:proofErr w:type="spellEnd"/>
-      <w:r>
-        <w:t>-based detail plots were introduced starting in V14.2.</w:t>
+      <w:r>
+        <w:t>ECharts-based detail plots were introduced starting in V14.2.</w:t>
       </w:r>
     </w:p>
     <w:p>
@@ -5559,15 +4691,7 @@
     </w:p>
     <w:p>
       <w:r>
-        <w:t xml:space="preserve">Browser-side memory accumulation related to </w:t>
-      </w:r>
-      <w:proofErr w:type="spellStart"/>
-      <w:r>
-        <w:t>ECharts</w:t>
-      </w:r>
-      <w:proofErr w:type="spellEnd"/>
-      <w:r>
-        <w:t xml:space="preserve"> plot rendering in older Edge version</w:t>
+        <w:t>Browser-side memory accumulation related to ECharts plot rendering in older Edge version</w:t>
       </w:r>
     </w:p>
     <w:p>
@@ -5587,15 +4711,7 @@
     </w:p>
     <w:p>
       <w:r>
-        <w:t xml:space="preserve">Evidence supports browser/client-side behavior rather than </w:t>
-      </w:r>
-      <w:proofErr w:type="spellStart"/>
-      <w:r>
-        <w:t>RTEService</w:t>
-      </w:r>
-      <w:proofErr w:type="spellEnd"/>
-      <w:r>
-        <w:t xml:space="preserve"> memory leak:</w:t>
+        <w:t>Evidence supports browser/client-side behavior rather than RTEService memory leak:</w:t>
       </w:r>
     </w:p>
     <w:p>
@@ -5605,13 +4721,8 @@
           <w:numId w:val="64"/>
         </w:numPr>
       </w:pPr>
-      <w:proofErr w:type="spellStart"/>
-      <w:r>
-        <w:t>RTEService</w:t>
-      </w:r>
-      <w:proofErr w:type="spellEnd"/>
-      <w:r>
-        <w:t xml:space="preserve"> memory remained stable.</w:t>
+      <w:r>
+        <w:t>RTEService memory remained stable.</w:t>
       </w:r>
     </w:p>
     <w:p>
@@ -5643,13 +4754,8 @@
     </w:p>
     <w:p>
       <w:r>
-        <w:t xml:space="preserve">QIAN, </w:t>
-      </w:r>
-      <w:proofErr w:type="spellStart"/>
-      <w:r>
-        <w:t>Yinjue</w:t>
-      </w:r>
-      <w:proofErr w:type="spellEnd"/>
+        <w:t>QIAN, Yinjue</w:t>
+      </w:r>
       <w:r>
         <w:t>:</w:t>
       </w:r>
@@ -5744,13 +4850,8 @@
           <w:numId w:val="65"/>
         </w:numPr>
       </w:pPr>
-      <w:proofErr w:type="spellStart"/>
-      <w:r>
-        <w:t>CodeChange</w:t>
-      </w:r>
-      <w:proofErr w:type="spellEnd"/>
-      <w:r>
-        <w:t>: False</w:t>
+      <w:r>
+        <w:t>CodeChange: False</w:t>
       </w:r>
     </w:p>
     <w:p>
@@ -5781,15 +4882,7 @@
     </w:p>
     <w:p>
       <w:r>
-        <w:t xml:space="preserve">Customer could deploy a controller initially without issue. However, redeployment failed unless the controller was renamed. Investigation revealed naming conflict between </w:t>
-      </w:r>
-      <w:proofErr w:type="spellStart"/>
-      <w:r>
-        <w:t>subcontroller</w:t>
-      </w:r>
-      <w:proofErr w:type="spellEnd"/>
-      <w:r>
-        <w:t xml:space="preserve"> names and test group names.</w:t>
+        <w:t>Customer could deploy a controller initially without issue. However, redeployment failed unless the controller was renamed. Investigation revealed naming conflict between subcontroller names and test group names.</w:t>
       </w:r>
     </w:p>
     <w:p>
@@ -5819,21 +4912,8 @@
           <w:numId w:val="66"/>
         </w:numPr>
       </w:pPr>
-      <w:proofErr w:type="spellStart"/>
-      <w:r>
-        <w:t>Subcontroller</w:t>
-      </w:r>
-      <w:proofErr w:type="spellEnd"/>
-      <w:r>
-        <w:t xml:space="preserve"> names </w:t>
-      </w:r>
-      <w:proofErr w:type="gramStart"/>
-      <w:r>
-        <w:t>identical</w:t>
-      </w:r>
-      <w:proofErr w:type="gramEnd"/>
-      <w:r>
-        <w:t xml:space="preserve"> to test group names.</w:t>
+      <w:r>
+        <w:t>Subcontroller names identical to test group names.</w:t>
       </w:r>
     </w:p>
     <w:p>
@@ -5844,15 +4924,7 @@
         </w:numPr>
       </w:pPr>
       <w:r>
-        <w:t xml:space="preserve">DMC3 Builder and </w:t>
-      </w:r>
-      <w:proofErr w:type="spellStart"/>
-      <w:r>
-        <w:t>DMCplus</w:t>
-      </w:r>
-      <w:proofErr w:type="spellEnd"/>
-      <w:r>
-        <w:t xml:space="preserve"> Build prevent this naming conflict in V14.4.</w:t>
+        <w:t>DMC3 Builder and DMCplus Build prevent this naming conflict in V14.4.</w:t>
       </w:r>
     </w:p>
     <w:p>
@@ -5863,15 +4935,7 @@
         </w:numPr>
       </w:pPr>
       <w:r>
-        <w:t xml:space="preserve">Importing exported CCF file into </w:t>
-      </w:r>
-      <w:proofErr w:type="spellStart"/>
-      <w:r>
-        <w:t>DMCplus</w:t>
-      </w:r>
-      <w:proofErr w:type="spellEnd"/>
-      <w:r>
-        <w:t xml:space="preserve"> Build and saving triggered validation errors regarding duplicate names.</w:t>
+        <w:t>Importing exported CCF file into DMCplus Build and saving triggered validation errors regarding duplicate names.</w:t>
       </w:r>
     </w:p>
     <w:p>
@@ -5882,15 +4946,7 @@
         </w:numPr>
       </w:pPr>
       <w:r>
-        <w:t xml:space="preserve">Renaming </w:t>
-      </w:r>
-      <w:proofErr w:type="spellStart"/>
-      <w:r>
-        <w:t>subcontrollers</w:t>
-      </w:r>
-      <w:proofErr w:type="spellEnd"/>
-      <w:r>
-        <w:t xml:space="preserve"> resolved redeploy issue.</w:t>
+        <w:t>Renaming subcontrollers resolved redeploy issue.</w:t>
       </w:r>
     </w:p>
     <w:p>
@@ -5932,15 +4988,7 @@
     </w:p>
     <w:p>
       <w:r>
-        <w:t xml:space="preserve">Naming conflict between </w:t>
-      </w:r>
-      <w:proofErr w:type="spellStart"/>
-      <w:r>
-        <w:t>subcontrollers</w:t>
-      </w:r>
-      <w:proofErr w:type="spellEnd"/>
-      <w:r>
-        <w:t xml:space="preserve"> and test groups causing validation failure during redeploy</w:t>
+        <w:t>Naming conflict between subcontrollers and test groups causing validation failure during redeploy</w:t>
       </w:r>
     </w:p>
     <w:p>
@@ -5987,35 +5035,7 @@
           <w:highlight w:val="yellow"/>
         </w:rPr>
         <w:lastRenderedPageBreak/>
-        <w:t xml:space="preserve">These look like </w:t>
-      </w:r>
-      <w:proofErr w:type="gramStart"/>
-      <w:r>
-        <w:rPr>
-          <w:highlight w:val="yellow"/>
-        </w:rPr>
-        <w:t>the they</w:t>
-      </w:r>
-      <w:proofErr w:type="gramEnd"/>
-      <w:r>
-        <w:rPr>
-          <w:highlight w:val="yellow"/>
-        </w:rPr>
-        <w:t xml:space="preserve"> are accurate. </w:t>
-      </w:r>
-      <w:proofErr w:type="spellStart"/>
-      <w:r>
-        <w:rPr>
-          <w:highlight w:val="yellow"/>
-        </w:rPr>
-        <w:t>Interecting</w:t>
-      </w:r>
-      <w:proofErr w:type="spellEnd"/>
-      <w:r>
-        <w:rPr>
-          <w:highlight w:val="yellow"/>
-        </w:rPr>
-        <w:t>.</w:t>
+        <w:t>These look like the they are accurate. Interecting.</w:t>
       </w:r>
     </w:p>
     <w:p>
@@ -6077,14 +5097,7 @@
       </w:r>
       <w:r>
         <w:br/>
-      </w:r>
-      <w:proofErr w:type="spellStart"/>
-      <w:r>
-        <w:t>AspenPlusEngine.Engine</w:t>
-      </w:r>
-      <w:proofErr w:type="spellEnd"/>
-      <w:r>
-        <w:t xml:space="preserve"> 73ae2d4551de146af8933462d2510968ad71fb06</w:t>
+        <w:t>AspenPlusEngine.Engine 73ae2d4551de146af8933462d2510968ad71fb06</w:t>
       </w:r>
     </w:p>
     <w:p>
@@ -6103,13 +5116,8 @@
           <w:numId w:val="67"/>
         </w:numPr>
       </w:pPr>
-      <w:proofErr w:type="spellStart"/>
-      <w:r>
-        <w:t>CodeChange</w:t>
-      </w:r>
-      <w:proofErr w:type="spellEnd"/>
-      <w:r>
-        <w:t>: True</w:t>
+      <w:r>
+        <w:t>CodeChange: True</w:t>
       </w:r>
     </w:p>
     <w:p>
@@ -6139,26 +5147,13 @@
       </w:r>
     </w:p>
     <w:p>
-      <w:proofErr w:type="spellStart"/>
-      <w:r>
-        <w:t>BatchOp</w:t>
-      </w:r>
-      <w:proofErr w:type="spellEnd"/>
-      <w:r>
-        <w:t xml:space="preserve"> simulation crashes near boiling point conditions (acetone or water) with Fortran error. Issue reproducible in both V14.5 and V15.</w:t>
-      </w:r>
-    </w:p>
-    <w:p>
-      <w:r>
-        <w:t xml:space="preserve">Crash linked to </w:t>
-      </w:r>
-      <w:proofErr w:type="spellStart"/>
-      <w:r>
-        <w:t>torispherical</w:t>
-      </w:r>
-      <w:proofErr w:type="spellEnd"/>
-      <w:r>
-        <w:t xml:space="preserve"> vessel head calculations when liquid level approaches head region.</w:t>
+      <w:r>
+        <w:t>BatchOp simulation crashes near boiling point conditions (acetone or water) with Fortran error. Issue reproducible in both V14.5 and V15.</w:t>
+      </w:r>
+    </w:p>
+    <w:p>
+      <w:r>
+        <w:t>Crash linked to torispherical vessel head calculations when liquid level approaches head region.</w:t>
       </w:r>
     </w:p>
     <w:p>
@@ -6189,25 +5184,7 @@
         </w:numPr>
       </w:pPr>
       <w:r>
-        <w:t xml:space="preserve">Root identified in </w:t>
-      </w:r>
-      <w:proofErr w:type="spellStart"/>
-      <w:proofErr w:type="gramStart"/>
-      <w:r>
-        <w:t>vesselcalcs.f</w:t>
-      </w:r>
-      <w:proofErr w:type="spellEnd"/>
-      <w:proofErr w:type="gramEnd"/>
-      <w:r>
-        <w:t xml:space="preserve">, </w:t>
-      </w:r>
-      <w:proofErr w:type="spellStart"/>
-      <w:r>
-        <w:t>torispherical</w:t>
-      </w:r>
-      <w:proofErr w:type="spellEnd"/>
-      <w:r>
-        <w:t xml:space="preserve"> head liquid level calculation.</w:t>
+        <w:t>Root identified in vesselcalcs.f, torispherical head liquid level calculation.</w:t>
       </w:r>
     </w:p>
     <w:p>
@@ -6240,15 +5217,7 @@
         </w:numPr>
       </w:pPr>
       <w:r>
-        <w:t xml:space="preserve">Existing approximation method for liquid level insufficient for </w:t>
-      </w:r>
-      <w:proofErr w:type="spellStart"/>
-      <w:r>
-        <w:t>torispherical</w:t>
-      </w:r>
-      <w:proofErr w:type="spellEnd"/>
-      <w:r>
-        <w:t xml:space="preserve"> geometry.</w:t>
+        <w:t>Existing approximation method for liquid level insufficient for torispherical geometry.</w:t>
       </w:r>
     </w:p>
     <w:p>
@@ -6312,15 +5281,7 @@
     </w:p>
     <w:p>
       <w:r>
-        <w:t xml:space="preserve">Incorrect liquid level convergence algorithm for </w:t>
-      </w:r>
-      <w:proofErr w:type="spellStart"/>
-      <w:r>
-        <w:t>torispherical</w:t>
-      </w:r>
-      <w:proofErr w:type="spellEnd"/>
-      <w:r>
-        <w:t xml:space="preserve"> vessel head geometry</w:t>
+        <w:t>Incorrect liquid level convergence algorithm for torispherical vessel head geometry</w:t>
       </w:r>
     </w:p>
     <w:p>
@@ -6363,15 +5324,7 @@
         </w:numPr>
       </w:pPr>
       <w:r>
-        <w:t xml:space="preserve">Mathematical convergence </w:t>
-      </w:r>
-      <w:proofErr w:type="gramStart"/>
-      <w:r>
-        <w:t>issue</w:t>
-      </w:r>
-      <w:proofErr w:type="gramEnd"/>
-      <w:r>
-        <w:t xml:space="preserve"> clearly identified.</w:t>
+        <w:t>Mathematical convergence issue clearly identified.</w:t>
       </w:r>
     </w:p>
     <w:p>
@@ -6382,15 +5335,7 @@
         </w:numPr>
       </w:pPr>
       <w:r>
-        <w:t xml:space="preserve">Algorithmic correction implemented and </w:t>
-      </w:r>
-      <w:proofErr w:type="gramStart"/>
-      <w:r>
-        <w:t>regression-tested</w:t>
-      </w:r>
-      <w:proofErr w:type="gramEnd"/>
-      <w:r>
-        <w:t>.</w:t>
+        <w:t>Algorithmic correction implemented and regression-tested.</w:t>
       </w:r>
     </w:p>
     <w:p>
@@ -6506,13 +5451,8 @@
           <w:numId w:val="70"/>
         </w:numPr>
       </w:pPr>
-      <w:proofErr w:type="spellStart"/>
-      <w:r>
-        <w:t>CodeChange</w:t>
-      </w:r>
-      <w:proofErr w:type="spellEnd"/>
-      <w:r>
-        <w:t>: False</w:t>
+      <w:r>
+        <w:t>CodeChange: False</w:t>
       </w:r>
     </w:p>
     <w:p>
@@ -6543,23 +5483,7 @@
     </w:p>
     <w:p>
       <w:r>
-        <w:t xml:space="preserve">Users on Windows 11 were unable to create </w:t>
-      </w:r>
-      <w:proofErr w:type="spellStart"/>
-      <w:r>
-        <w:t>config.aem</w:t>
-      </w:r>
-      <w:proofErr w:type="spellEnd"/>
-      <w:r>
-        <w:t xml:space="preserve"> file for APED database. Standard troubleshooting </w:t>
-      </w:r>
-      <w:proofErr w:type="gramStart"/>
-      <w:r>
-        <w:t>unsuccessful</w:t>
-      </w:r>
-      <w:proofErr w:type="gramEnd"/>
-      <w:r>
-        <w:t>.</w:t>
+        <w:t>Users on Windows 11 were unable to create config.aem file for APED database. Standard troubleshooting unsuccessful.</w:t>
       </w:r>
     </w:p>
     <w:p>
@@ -6590,23 +5514,7 @@
         </w:numPr>
       </w:pPr>
       <w:r>
-        <w:t xml:space="preserve">SQL </w:t>
-      </w:r>
-      <w:proofErr w:type="spellStart"/>
-      <w:r>
-        <w:t>LocalDB</w:t>
-      </w:r>
-      <w:proofErr w:type="spellEnd"/>
-      <w:r>
-        <w:t xml:space="preserve"> </w:t>
-      </w:r>
-      <w:proofErr w:type="gramStart"/>
-      <w:r>
-        <w:t>was not functioning</w:t>
-      </w:r>
-      <w:proofErr w:type="gramEnd"/>
-      <w:r>
-        <w:t xml:space="preserve"> correctly on Windows 11.</w:t>
+        <w:t>SQL LocalDB was not functioning correctly on Windows 11.</w:t>
       </w:r>
     </w:p>
     <w:p>
@@ -6644,15 +5552,7 @@
         <w:ind w:left="720"/>
       </w:pPr>
       <w:r>
-        <w:t>/v "</w:t>
-      </w:r>
-      <w:proofErr w:type="spellStart"/>
-      <w:r>
-        <w:t>ForcedPhysicalSectorSizeInBytes</w:t>
-      </w:r>
-      <w:proofErr w:type="spellEnd"/>
-      <w:r>
-        <w:t>"</w:t>
+        <w:t>/v "ForcedPhysicalSectorSizeInBytes"</w:t>
       </w:r>
     </w:p>
     <w:p>
@@ -6702,15 +5602,7 @@
     </w:p>
     <w:p>
       <w:r>
-        <w:t xml:space="preserve">SQL </w:t>
-      </w:r>
-      <w:proofErr w:type="spellStart"/>
-      <w:r>
-        <w:t>LocalDB</w:t>
-      </w:r>
-      <w:proofErr w:type="spellEnd"/>
-      <w:r>
-        <w:t xml:space="preserve"> compatibility issue with Windows 11 storage configuration</w:t>
+        <w:t>SQL LocalDB compatibility issue with Windows 11 storage configuration</w:t>
       </w:r>
     </w:p>
     <w:p>
@@ -6730,15 +5622,7 @@
     </w:p>
     <w:p>
       <w:r>
-        <w:t xml:space="preserve">Clear environmental configuration </w:t>
-      </w:r>
-      <w:proofErr w:type="gramStart"/>
-      <w:r>
-        <w:t>issue</w:t>
-      </w:r>
-      <w:proofErr w:type="gramEnd"/>
-      <w:r>
-        <w:t>.</w:t>
+        <w:t>Clear environmental configuration issue.</w:t>
       </w:r>
     </w:p>
     <w:p>
@@ -6760,15 +5644,7 @@
         </w:numPr>
       </w:pPr>
       <w:r>
-        <w:t xml:space="preserve">OS-level SQL </w:t>
-      </w:r>
-      <w:proofErr w:type="spellStart"/>
-      <w:r>
-        <w:t>LocalDB</w:t>
-      </w:r>
-      <w:proofErr w:type="spellEnd"/>
-      <w:r>
-        <w:t xml:space="preserve"> behavior.</w:t>
+        <w:t>OS-level SQL LocalDB behavior.</w:t>
       </w:r>
     </w:p>
     <w:p>
@@ -6852,29 +5728,13 @@
           <w:bCs/>
           <w:highlight w:val="yellow"/>
         </w:rPr>
-        <w:t xml:space="preserve">next release scheduled May </w:t>
-      </w:r>
-      <w:proofErr w:type="gramStart"/>
-      <w:r>
-        <w:rPr>
-          <w:b/>
-          <w:bCs/>
+        <w:t>next release scheduled May 2026</w:t>
+      </w:r>
+      <w:r>
+        <w:rPr>
           <w:highlight w:val="yellow"/>
         </w:rPr>
-        <w:t>2026</w:t>
-      </w:r>
-      <w:r>
-        <w:rPr>
-          <w:highlight w:val="yellow"/>
-        </w:rPr>
-        <w:t>..</w:t>
-      </w:r>
-      <w:proofErr w:type="gramEnd"/>
-      <w:r>
-        <w:rPr>
-          <w:highlight w:val="yellow"/>
-        </w:rPr>
-        <w:t xml:space="preserve"> Just next release.</w:t>
+        <w:t>.. Just next release.</w:t>
       </w:r>
     </w:p>
     <w:p>
@@ -6955,13 +5815,8 @@
           <w:numId w:val="73"/>
         </w:numPr>
       </w:pPr>
-      <w:proofErr w:type="spellStart"/>
-      <w:r>
-        <w:t>CodeChange</w:t>
-      </w:r>
-      <w:proofErr w:type="spellEnd"/>
-      <w:r>
-        <w:t>: True</w:t>
+      <w:r>
+        <w:t>CodeChange: True</w:t>
       </w:r>
     </w:p>
     <w:p>
@@ -7004,15 +5859,7 @@
       </w:pPr>
       <w:r>
         <w:lastRenderedPageBreak/>
-        <w:t xml:space="preserve">OOL (Out-of-Limits) correction values </w:t>
-      </w:r>
-      <w:proofErr w:type="gramStart"/>
-      <w:r>
-        <w:t>not</w:t>
-      </w:r>
-      <w:proofErr w:type="gramEnd"/>
-      <w:r>
-        <w:t xml:space="preserve"> validated correctly.</w:t>
+        <w:t>OOL (Out-of-Limits) correction values not validated correctly.</w:t>
       </w:r>
     </w:p>
     <w:p>
@@ -7045,15 +5892,7 @@
         </w:numPr>
       </w:pPr>
       <w:r>
-        <w:t xml:space="preserve">Validation logic </w:t>
-      </w:r>
-      <w:proofErr w:type="gramStart"/>
-      <w:r>
-        <w:t>not</w:t>
-      </w:r>
-      <w:proofErr w:type="gramEnd"/>
-      <w:r>
-        <w:t xml:space="preserve"> triggered when clicking OK directly without leaving field.</w:t>
+        <w:t>Validation logic not triggered when clicking OK directly without leaving field.</w:t>
       </w:r>
     </w:p>
     <w:p>
@@ -7106,15 +5945,7 @@
         </w:numPr>
       </w:pPr>
       <w:r>
-        <w:t xml:space="preserve">Input value </w:t>
-      </w:r>
-      <w:proofErr w:type="gramStart"/>
-      <w:r>
-        <w:t>not</w:t>
-      </w:r>
-      <w:proofErr w:type="gramEnd"/>
-      <w:r>
-        <w:t xml:space="preserve"> saved to server side.</w:t>
+        <w:t>Input value not saved to server side.</w:t>
       </w:r>
     </w:p>
     <w:p>
@@ -7125,15 +5956,7 @@
         </w:numPr>
       </w:pPr>
       <w:r>
-        <w:t xml:space="preserve">Validation execution logic </w:t>
-      </w:r>
-      <w:proofErr w:type="gramStart"/>
-      <w:r>
-        <w:t>not</w:t>
-      </w:r>
-      <w:proofErr w:type="gramEnd"/>
-      <w:r>
-        <w:t xml:space="preserve"> triggered on certain UI flows.</w:t>
+        <w:t>Validation execution logic not triggered on certain UI flows.</w:t>
       </w:r>
     </w:p>
     <w:p>
@@ -7287,24 +6110,14 @@
       </w:r>
     </w:p>
     <w:p>
-      <w:proofErr w:type="gramStart"/>
-      <w:r>
-        <w:t>High-severity</w:t>
-      </w:r>
-      <w:proofErr w:type="gramEnd"/>
-      <w:r>
-        <w:t xml:space="preserve"> but properly resolved.</w:t>
-      </w:r>
-    </w:p>
-    <w:p>
-      <w:r>
-        <w:t xml:space="preserve">QIAN, </w:t>
-      </w:r>
-      <w:proofErr w:type="spellStart"/>
-      <w:r>
-        <w:t>Yinjue</w:t>
-      </w:r>
-      <w:proofErr w:type="spellEnd"/>
+      <w:r>
+        <w:t>High-severity but properly resolved.</w:t>
+      </w:r>
+    </w:p>
+    <w:p>
+      <w:r>
+        <w:t>QIAN, Yinjue</w:t>
+      </w:r>
       <w:r>
         <w:t>:</w:t>
       </w:r>
@@ -7399,13 +6212,8 @@
           <w:numId w:val="77"/>
         </w:numPr>
       </w:pPr>
-      <w:proofErr w:type="spellStart"/>
-      <w:r>
-        <w:t>CodeChange</w:t>
-      </w:r>
-      <w:proofErr w:type="spellEnd"/>
-      <w:r>
-        <w:t>: False</w:t>
+      <w:r>
+        <w:t>CodeChange: False</w:t>
       </w:r>
     </w:p>
     <w:p>
@@ -7436,15 +6244,7 @@
     </w:p>
     <w:p>
       <w:r>
-        <w:t xml:space="preserve">Customer reported that an RTE controller deployed for the first time in V14.4 could not perform writes (notably setpoint writes), although variable mode changed (OPC mode switched to cascade). The same logical device worked when using </w:t>
-      </w:r>
-      <w:proofErr w:type="spellStart"/>
-      <w:r>
-        <w:t>DMCplus</w:t>
-      </w:r>
-      <w:proofErr w:type="spellEnd"/>
-      <w:r>
-        <w:t xml:space="preserve"> Online controller. Multiple attempts (sync off / async) did not resolve the write failure; CIMIO logs and meeting recording were attached.</w:t>
+        <w:t>Customer reported that an RTE controller deployed for the first time in V14.4 could not perform writes (notably setpoint writes), although variable mode changed (OPC mode switched to cascade). The same logical device worked when using DMCplus Online controller. Multiple attempts (sync off / async) did not resolve the write failure; CIMIO logs and meeting recording were attached.</w:t>
       </w:r>
     </w:p>
     <w:p>
@@ -7583,35 +6383,7 @@
         <w:rPr>
           <w:highlight w:val="yellow"/>
         </w:rPr>
-        <w:t xml:space="preserve">These look like </w:t>
-      </w:r>
-      <w:proofErr w:type="gramStart"/>
-      <w:r>
-        <w:rPr>
-          <w:highlight w:val="yellow"/>
-        </w:rPr>
-        <w:t>the they</w:t>
-      </w:r>
-      <w:proofErr w:type="gramEnd"/>
-      <w:r>
-        <w:rPr>
-          <w:highlight w:val="yellow"/>
-        </w:rPr>
-        <w:t xml:space="preserve"> are accurate. </w:t>
-      </w:r>
-      <w:proofErr w:type="spellStart"/>
-      <w:r>
-        <w:rPr>
-          <w:highlight w:val="yellow"/>
-        </w:rPr>
-        <w:t>Interecting</w:t>
-      </w:r>
-      <w:proofErr w:type="spellEnd"/>
-      <w:r>
-        <w:rPr>
-          <w:highlight w:val="yellow"/>
-        </w:rPr>
-        <w:t>.</w:t>
+        <w:t>These look like the they are accurate. Interecting.</w:t>
       </w:r>
     </w:p>
     <w:p>
@@ -7693,13 +6465,8 @@
           <w:numId w:val="79"/>
         </w:numPr>
       </w:pPr>
-      <w:proofErr w:type="spellStart"/>
-      <w:r>
-        <w:t>CodeChange</w:t>
-      </w:r>
-      <w:proofErr w:type="spellEnd"/>
-      <w:r>
-        <w:t>: True (per record)</w:t>
+      <w:r>
+        <w:t>CodeChange: True (per record)</w:t>
       </w:r>
     </w:p>
     <w:p>
@@ -7729,13 +6496,8 @@
       </w:r>
     </w:p>
     <w:p>
-      <w:proofErr w:type="spellStart"/>
-      <w:r>
-        <w:t>GraphQL</w:t>
-      </w:r>
-      <w:proofErr w:type="spellEnd"/>
-      <w:r>
-        <w:t xml:space="preserve"> returned </w:t>
+      <w:r>
+        <w:t xml:space="preserve">GraphQL returned </w:t>
       </w:r>
       <w:r>
         <w:rPr>
@@ -7745,15 +6507,7 @@
         <w:t>null</w:t>
       </w:r>
       <w:r>
-        <w:t xml:space="preserve"> instead of the tank name for some event(s). In AUS UI, tank name was visible when opening event details, suggesting the backend data existed but </w:t>
-      </w:r>
-      <w:proofErr w:type="spellStart"/>
-      <w:r>
-        <w:t>GraphQL</w:t>
-      </w:r>
-      <w:proofErr w:type="spellEnd"/>
-      <w:r>
-        <w:t xml:space="preserve"> response was missing/incorrect for certain contexts/cases.</w:t>
+        <w:t xml:space="preserve"> instead of the tank name for some event(s). In AUS UI, tank name was visible when opening event details, suggesting the backend data existed but GraphQL response was missing/incorrect for certain contexts/cases.</w:t>
       </w:r>
     </w:p>
     <w:p>
@@ -7863,15 +6617,7 @@
         <w:t>Verified</w:t>
       </w:r>
       <w:r>
-        <w:t xml:space="preserve"> because target </w:t>
-      </w:r>
-      <w:proofErr w:type="gramStart"/>
-      <w:r>
-        <w:t>fix</w:t>
-      </w:r>
-      <w:proofErr w:type="gramEnd"/>
-      <w:r>
-        <w:t xml:space="preserve"> versions were not all in Closed state.</w:t>
+        <w:t xml:space="preserve"> because target fix versions were not all in Closed state.</w:t>
       </w:r>
     </w:p>
     <w:p>
@@ -7891,15 +6637,7 @@
     </w:p>
     <w:p>
       <w:r>
-        <w:t xml:space="preserve">Likely fixed defect in later release (V15.1) affecting </w:t>
-      </w:r>
-      <w:proofErr w:type="spellStart"/>
-      <w:r>
-        <w:t>GraphQL</w:t>
-      </w:r>
-      <w:proofErr w:type="spellEnd"/>
-      <w:r>
-        <w:t xml:space="preserve"> tank-name field mapping/serialization for certain events</w:t>
+        <w:t>Likely fixed defect in later release (V15.1) affecting GraphQL tank-name field mapping/serialization for certain events</w:t>
       </w:r>
     </w:p>
     <w:p>
@@ -7929,15 +6667,7 @@
         <w:t>insufficient evidence</w:t>
       </w:r>
       <w:r>
-        <w:t xml:space="preserve"> for a concrete root cause (no code pointer, no explicit fix commit, and </w:t>
-      </w:r>
-      <w:proofErr w:type="spellStart"/>
-      <w:r>
-        <w:t>root_cause</w:t>
-      </w:r>
-      <w:proofErr w:type="spellEnd"/>
-      <w:r>
-        <w:t xml:space="preserve"> field blank).</w:t>
+        <w:t xml:space="preserve"> for a concrete root cause (no code pointer, no explicit fix commit, and root_cause field blank).</w:t>
       </w:r>
     </w:p>
     <w:p>
@@ -8067,13 +6797,8 @@
           <w:numId w:val="82"/>
         </w:numPr>
       </w:pPr>
-      <w:proofErr w:type="spellStart"/>
-      <w:r>
-        <w:t>CodeChange</w:t>
-      </w:r>
-      <w:proofErr w:type="spellEnd"/>
-      <w:r>
-        <w:t>: False</w:t>
+      <w:r>
+        <w:t>CodeChange: False</w:t>
       </w:r>
     </w:p>
     <w:p>
@@ -8103,13 +6828,8 @@
       </w:r>
     </w:p>
     <w:p>
-      <w:proofErr w:type="gramStart"/>
-      <w:r>
-        <w:t>Customer</w:t>
-      </w:r>
-      <w:proofErr w:type="gramEnd"/>
-      <w:r>
-        <w:t xml:space="preserve"> experienced an </w:t>
+      <w:r>
+        <w:t xml:space="preserve">Customer experienced an </w:t>
       </w:r>
       <w:r>
         <w:rPr>
@@ -8119,15 +6839,7 @@
         <w:t>intermittent SCM crash</w:t>
       </w:r>
       <w:r>
-        <w:t xml:space="preserve"> in a specific model (SCM 14.0.7). Crash seemed random but could often occur when running MN-OPT. Customer suspected recent “benign” </w:t>
-      </w:r>
-      <w:proofErr w:type="spellStart"/>
-      <w:r>
-        <w:t>AlphaSolve</w:t>
-      </w:r>
-      <w:proofErr w:type="spellEnd"/>
-      <w:r>
-        <w:t xml:space="preserve"> logic changes; the only potentially relevant change mentioned was adding tables _RAR, _RAR1, _RAX to an object used in SAVDATA/GETDATA (_ALPSAV).</w:t>
+        <w:t xml:space="preserve"> in a specific model (SCM 14.0.7). Crash seemed random but could often occur when running MN-OPT. Customer suspected recent “benign” AlphaSolve logic changes; the only potentially relevant change mentioned was adding tables _RAR, _RAR1, _RAX to an object used in SAVDATA/GETDATA (_ALPSAV).</w:t>
       </w:r>
     </w:p>
     <w:p>
@@ -8305,14 +7017,7 @@
       </w:r>
       <w:r>
         <w:br/>
-      </w:r>
-      <w:proofErr w:type="spellStart"/>
-      <w:r>
-        <w:t>aspenONE</w:t>
-      </w:r>
-      <w:proofErr w:type="spellEnd"/>
-      <w:r>
-        <w:t xml:space="preserve"> Process Explorer</w:t>
+        <w:t>aspenONE Process Explorer</w:t>
       </w:r>
     </w:p>
     <w:p>
@@ -8358,13 +7063,8 @@
           <w:numId w:val="84"/>
         </w:numPr>
       </w:pPr>
-      <w:proofErr w:type="spellStart"/>
-      <w:r>
-        <w:t>CodeChange</w:t>
-      </w:r>
-      <w:proofErr w:type="spellEnd"/>
-      <w:r>
-        <w:t>: True</w:t>
+      <w:r>
+        <w:t>CodeChange: True</w:t>
       </w:r>
     </w:p>
     <w:p>
@@ -8405,15 +7105,7 @@
         <w:t>Trend object</w:t>
       </w:r>
       <w:r>
-        <w:t xml:space="preserve"> Y-axis label section appears larger after publishing than it does in Studio, creating oversized “black zones” and blocking other views. Behavior was fine in V14.2 and became apparent after </w:t>
-      </w:r>
-      <w:proofErr w:type="gramStart"/>
-      <w:r>
-        <w:t>upgrade</w:t>
-      </w:r>
-      <w:proofErr w:type="gramEnd"/>
-      <w:r>
-        <w:t xml:space="preserve"> to V14.5. Issue specifically impacts </w:t>
+        <w:t xml:space="preserve"> Y-axis label section appears larger after publishing than it does in Studio, creating oversized “black zones” and blocking other views. Behavior was fine in V14.2 and became apparent after upgrade to V14.5. Issue specifically impacts </w:t>
       </w:r>
       <w:r>
         <w:rPr>
@@ -8725,13 +7417,8 @@
           <w:numId w:val="87"/>
         </w:numPr>
       </w:pPr>
-      <w:proofErr w:type="spellStart"/>
-      <w:r>
-        <w:t>CodeChange</w:t>
-      </w:r>
-      <w:proofErr w:type="spellEnd"/>
-      <w:r>
-        <w:t>: True (per record)</w:t>
+      <w:r>
+        <w:t>CodeChange: True (per record)</w:t>
       </w:r>
     </w:p>
     <w:p>
@@ -8819,17 +7506,7 @@
         </w:numPr>
       </w:pPr>
       <w:r>
-        <w:t xml:space="preserve">Aspen noted plan to upgrade dependency to </w:t>
-      </w:r>
-      <w:proofErr w:type="spellStart"/>
-      <w:proofErr w:type="gramStart"/>
-      <w:r>
-        <w:t>Microsoft.SqlServer.SqlManagementObjects</w:t>
-      </w:r>
-      <w:proofErr w:type="spellEnd"/>
-      <w:proofErr w:type="gramEnd"/>
-      <w:r>
-        <w:t xml:space="preserve"> 172.64.0 in a future release.</w:t>
+        <w:t>Aspen noted plan to upgrade dependency to Microsoft.SqlServer.SqlManagementObjects 172.64.0 in a future release.</w:t>
       </w:r>
     </w:p>
     <w:p>
@@ -8861,13 +7538,8 @@
         </w:numPr>
       </w:pPr>
       <w:r>
-        <w:t xml:space="preserve">Customer asked for workaround (e.g., uninstall SMO). Response: no workaround for restoring/registering new DB without it; asked if customer uses custom </w:t>
-      </w:r>
-      <w:proofErr w:type="spellStart"/>
-      <w:r>
-        <w:t>DBs.</w:t>
-      </w:r>
-      <w:proofErr w:type="spellEnd"/>
+        <w:t>Customer asked for workaround (e.g., uninstall SMO). Response: no workaround for restoring/registering new DB without it; asked if customer uses custom DBs.</w:t>
+      </w:r>
     </w:p>
     <w:p>
       <w:pPr>
@@ -8877,15 +7549,7 @@
         </w:numPr>
       </w:pPr>
       <w:r>
-        <w:t xml:space="preserve">Ongoing customer communication </w:t>
-      </w:r>
-      <w:proofErr w:type="gramStart"/>
-      <w:r>
-        <w:t>need</w:t>
-      </w:r>
-      <w:proofErr w:type="gramEnd"/>
-      <w:r>
-        <w:t>; no closure shown in provided log.</w:t>
+        <w:t>Ongoing customer communication need; no closure shown in provided log.</w:t>
       </w:r>
     </w:p>
     <w:p>
@@ -8905,15 +7569,7 @@
     </w:p>
     <w:p>
       <w:r>
-        <w:t xml:space="preserve">Use of legacy SMO 2014 dependency creates support-lifecycle/security </w:t>
-      </w:r>
-      <w:proofErr w:type="gramStart"/>
-      <w:r>
-        <w:t>concern;</w:t>
-      </w:r>
-      <w:proofErr w:type="gramEnd"/>
-      <w:r>
-        <w:t xml:space="preserve"> mismatch between assumed support status and Microsoft lifecycle interpretation</w:t>
+        <w:t>Use of legacy SMO 2014 dependency creates support-lifecycle/security concern; mismatch between assumed support status and Microsoft lifecycle interpretation</w:t>
       </w:r>
     </w:p>
     <w:p>
@@ -9080,29 +7736,13 @@
           <w:bCs/>
           <w:highlight w:val="yellow"/>
         </w:rPr>
-        <w:t xml:space="preserve">next release scheduled May </w:t>
-      </w:r>
-      <w:proofErr w:type="gramStart"/>
-      <w:r>
-        <w:rPr>
-          <w:b/>
-          <w:bCs/>
+        <w:t>next release scheduled May 2026</w:t>
+      </w:r>
+      <w:r>
+        <w:rPr>
           <w:highlight w:val="yellow"/>
         </w:rPr>
-        <w:t>2026</w:t>
-      </w:r>
-      <w:r>
-        <w:rPr>
-          <w:highlight w:val="yellow"/>
-        </w:rPr>
-        <w:t>..</w:t>
-      </w:r>
-      <w:proofErr w:type="gramEnd"/>
-      <w:r>
-        <w:rPr>
-          <w:highlight w:val="yellow"/>
-        </w:rPr>
-        <w:t xml:space="preserve"> Just next release.</w:t>
+        <w:t>.. Just next release.</w:t>
       </w:r>
     </w:p>
     <w:sectPr>

</xml_diff>